<commit_message>
docs: remove reminder/review-backend scope; replace tool logo
- Drop REM-*/REV-* acceptance items, regenerate acceptance standard, and remove 5.3 reminder section plus deadline-reminder row from the requirements doc
- Replace the tool logo with the new image across the UI brand mark, favicon, and app icon
- Update README/PRODUCT for the published private repo and GitHub Releases
</commit_message>
<xml_diff>
--- a/《杜绝信息差》最高等级验收标准_V1.0.docx
+++ b/《杜绝信息差》最高等级验收标准_V1.0.docx
@@ -305,7 +305,7 @@
                 <w:color w:val="172B3A"/>
                 <w:sz w:val="20"/>
               </w:rPr>
-              <w:t>2026-08-08</w:t>
+              <w:t>2026-08-11</w:t>
             </w:r>
           </w:p>
         </w:tc>
@@ -409,7 +409,7 @@
                 <w:color w:val="172B3A"/>
                 <w:sz w:val="20"/>
               </w:rPr>
-              <w:t>Windows 10/11 x64安装包、生产数据包、审核后台与更新服务</w:t>
+              <w:t>Windows 10/11 x64安装包、生产数据包与更新服务</w:t>
             </w:r>
           </w:p>
         </w:tc>
@@ -1391,7 +1391,7 @@
           <w:color w:val="172B3A"/>
           <w:sz w:val="22"/>
         </w:rPr>
-        <w:t>本文件定义《杜绝信息差——大学生友好竞赛消息工具》的最高等级发布验收标准。验收对象包括桌面应用、中央抓取与审核链路、签名数据包、独立审核后台、自动更新服务、安装包及发布文档。</w:t>
+        <w:t>本文件定义《杜绝信息差——大学生友好竞赛消息工具》的最高等级发布验收标准。验收对象包括桌面应用、中央抓取与审核链路、签名数据包、自动更新服务、安装包及发布文档。</w:t>
       </w:r>
     </w:p>
     <w:p>
@@ -1926,7 +1926,7 @@
                 <w:color w:val="172B3A"/>
                 <w:sz w:val="19"/>
               </w:rPr>
-              <w:t>签名、回滚、隐私、后台安全和外链白名单全部通过。</w:t>
+              <w:t>签名、回滚、隐私和外链白名单全部通过。</w:t>
             </w:r>
           </w:p>
         </w:tc>
@@ -3034,57 +3034,6 @@
                 <w:color w:val="172B3A"/>
                 <w:sz w:val="19"/>
               </w:rPr>
-              <w:t>审核后台版本</w:t>
-            </w:r>
-          </w:p>
-        </w:tc>
-        <w:tc>
-          <w:tcPr>
-            <w:tcW w:type="dxa" w:w="6660"/>
-            <w:vAlign w:val="center"/>
-            <w:tcMar>
-              <w:top w:w="80" w:type="dxa"/>
-              <w:start w:w="120" w:type="dxa"/>
-              <w:bottom w:w="80" w:type="dxa"/>
-              <w:end w:w="120" w:type="dxa"/>
-            </w:tcMar>
-          </w:tcPr>
-          <w:p>
-            <w:pPr>
-              <w:spacing w:after="0" w:line="252" w:lineRule="auto"/>
-            </w:pPr>
-            <w:r>
-              <w:rPr>
-                <w:rFonts w:ascii="Calibri" w:hAnsi="Calibri" w:eastAsia="Microsoft YaHei"/>
-                <w:color w:val="172B3A"/>
-                <w:sz w:val="19"/>
-              </w:rPr>
-            </w:r>
-          </w:p>
-        </w:tc>
-      </w:tr>
-      <w:tr>
-        <w:tc>
-          <w:tcPr>
-            <w:tcW w:type="dxa" w:w="2700"/>
-            <w:vAlign w:val="center"/>
-            <w:tcMar>
-              <w:top w:w="80" w:type="dxa"/>
-              <w:start w:w="120" w:type="dxa"/>
-              <w:bottom w:w="80" w:type="dxa"/>
-              <w:end w:w="120" w:type="dxa"/>
-            </w:tcMar>
-          </w:tcPr>
-          <w:p>
-            <w:pPr>
-              <w:spacing w:after="0" w:line="252" w:lineRule="auto"/>
-            </w:pPr>
-            <w:r>
-              <w:rPr>
-                <w:rFonts w:ascii="Calibri" w:hAnsi="Calibri" w:eastAsia="Microsoft YaHei"/>
-                <w:color w:val="172B3A"/>
-                <w:sz w:val="19"/>
-              </w:rPr>
               <w:t>更新服务版本</w:t>
             </w:r>
           </w:p>
@@ -3347,7 +3296,7 @@
           <w:color w:val="172B3A"/>
           <w:sz w:val="22"/>
         </w:rPr>
-        <w:t>候选安装包、生产数据包、审核后台和更新服务的版本已冻结，验收期间不允许无记录变更。</w:t>
+        <w:t>候选安装包、生产数据包和更新服务的版本已冻结，验收期间不允许无记录变更。</w:t>
       </w:r>
     </w:p>
     <w:p>
@@ -6127,7 +6076,7 @@
                 <w:color w:val="172B3A"/>
                 <w:sz w:val="15"/>
               </w:rPr>
-              <w:t>REV-001</w:t>
+              <w:t>DET-001</w:t>
             </w:r>
           </w:p>
         </w:tc>
@@ -6178,7 +6127,7 @@
                 <w:color w:val="172B3A"/>
                 <w:sz w:val="15"/>
               </w:rPr>
-              <w:t>审核后台支持新增、修改、合并、退回、批准、批量复核和发布。</w:t>
+              <w:t>详情支持正式名称、英文显示名、届次、类别、主办方、级别、对象和专业限制。</w:t>
             </w:r>
           </w:p>
         </w:tc>
@@ -6203,7 +6152,7 @@
                 <w:color w:val="172B3A"/>
                 <w:sz w:val="15"/>
               </w:rPr>
-              <w:t>逐操作执行并核对权限和结果。</w:t>
+              <w:t>逐字段检查正常、未知和超长文本。</w:t>
             </w:r>
           </w:p>
         </w:tc>
@@ -6228,7 +6177,7 @@
                 <w:color w:val="172B3A"/>
                 <w:sz w:val="15"/>
               </w:rPr>
-              <w:t>操作录像、审计日志</w:t>
+              <w:t>详情截图、字段报告</w:t>
             </w:r>
           </w:p>
         </w:tc>
@@ -6329,7 +6278,7 @@
                 <w:color w:val="172B3A"/>
                 <w:sz w:val="15"/>
               </w:rPr>
-              <w:t>REV-002</w:t>
+              <w:t>DET-002</w:t>
             </w:r>
           </w:p>
         </w:tc>
@@ -6355,7 +6304,7 @@
                 <w:color w:val="172B3A"/>
                 <w:sz w:val="15"/>
               </w:rPr>
-              <w:t>P1</w:t>
+              <w:t>P0</w:t>
             </w:r>
           </w:p>
         </w:tc>
@@ -6380,7 +6329,7 @@
                 <w:color w:val="172B3A"/>
                 <w:sz w:val="15"/>
               </w:rPr>
-              <w:t>社区用户免登录提交来源；提交可追踪且不能直接进入生产数据。</w:t>
+              <w:t>分别记录报名开始、截止、初赛、复赛、决赛和结果公布时间。</w:t>
             </w:r>
           </w:p>
         </w:tc>
@@ -6405,7 +6354,7 @@
                 <w:color w:val="172B3A"/>
                 <w:sz w:val="15"/>
               </w:rPr>
-              <w:t>提交合法、重复、恶意和缺字段样本。</w:t>
+              <w:t>检查多阶段、缺阶段和待公布记录。</w:t>
             </w:r>
           </w:p>
         </w:tc>
@@ -6430,7 +6379,7 @@
                 <w:color w:val="172B3A"/>
                 <w:sz w:val="15"/>
               </w:rPr>
-              <w:t>提交记录、审核状态</w:t>
+              <w:t>时间节点截图</w:t>
             </w:r>
           </w:p>
         </w:tc>
@@ -6531,7 +6480,7 @@
                 <w:color w:val="172B3A"/>
                 <w:sz w:val="15"/>
               </w:rPr>
-              <w:t>REV-003</w:t>
+              <w:t>DET-003</w:t>
             </w:r>
           </w:p>
         </w:tc>
@@ -6582,7 +6531,7 @@
                 <w:color w:val="172B3A"/>
                 <w:sz w:val="15"/>
               </w:rPr>
-              <w:t>负责人后台启用多因素认证；审核发布操作写入不可篡改审计日志。</w:t>
+              <w:t>形式、地点、时区、费用及未知/待公布状态表达明确。</w:t>
             </w:r>
           </w:p>
         </w:tc>
@@ -6607,7 +6556,7 @@
                 <w:color w:val="172B3A"/>
                 <w:sz w:val="15"/>
               </w:rPr>
-              <w:t>验证登录、MFA、越权和日志完整性。</w:t>
+              <w:t>验证线上、线下、混合、跨时区和未知值。</w:t>
             </w:r>
           </w:p>
         </w:tc>
@@ -6632,7 +6581,7 @@
                 <w:color w:val="172B3A"/>
                 <w:sz w:val="15"/>
               </w:rPr>
-              <w:t>安全测试报告</w:t>
+              <w:t>场景截图</w:t>
             </w:r>
           </w:p>
         </w:tc>
@@ -6733,7 +6682,7 @@
                 <w:color w:val="172B3A"/>
                 <w:sz w:val="15"/>
               </w:rPr>
-              <w:t>DET-001</w:t>
+              <w:t>DET-004</w:t>
             </w:r>
           </w:p>
         </w:tc>
@@ -6784,7 +6733,7 @@
                 <w:color w:val="172B3A"/>
                 <w:sz w:val="15"/>
               </w:rPr>
-              <w:t>详情支持正式名称、英文显示名、届次、类别、主办方、级别、对象和专业限制。</w:t>
+              <w:t>官网、报名页和下载/填写/上传材料清单完整；附件只链接官网下载。</w:t>
             </w:r>
           </w:p>
         </w:tc>
@@ -6809,7 +6758,7 @@
                 <w:color w:val="172B3A"/>
                 <w:sz w:val="15"/>
               </w:rPr>
-              <w:t>逐字段检查正常、未知和超长文本。</w:t>
+              <w:t>逐链接打开并确认未缓存第三方附件。</w:t>
             </w:r>
           </w:p>
         </w:tc>
@@ -6834,7 +6783,7 @@
                 <w:color w:val="172B3A"/>
                 <w:sz w:val="15"/>
               </w:rPr>
-              <w:t>详情截图、字段报告</w:t>
+              <w:t>链接检查报告</w:t>
             </w:r>
           </w:p>
         </w:tc>
@@ -6935,7 +6884,7 @@
                 <w:color w:val="172B3A"/>
                 <w:sz w:val="15"/>
               </w:rPr>
-              <w:t>DET-002</w:t>
+              <w:t>DET-005</w:t>
             </w:r>
           </w:p>
         </w:tc>
@@ -6986,7 +6935,7 @@
                 <w:color w:val="172B3A"/>
                 <w:sz w:val="15"/>
               </w:rPr>
-              <w:t>分别记录报名开始、截止、初赛、复赛、决赛和结果公布时间。</w:t>
+              <w:t>难度星级有证据、充分度和暂无评级状态；允许设置个人星级且不覆盖系统评级。</w:t>
             </w:r>
           </w:p>
         </w:tc>
@@ -7011,7 +6960,7 @@
                 <w:color w:val="172B3A"/>
                 <w:sz w:val="15"/>
               </w:rPr>
-              <w:t>检查多阶段、缺阶段和待公布记录。</w:t>
+              <w:t>验证有证据、无证据和个人修改场景。</w:t>
             </w:r>
           </w:p>
         </w:tc>
@@ -7036,7 +6985,7 @@
                 <w:color w:val="172B3A"/>
                 <w:sz w:val="15"/>
               </w:rPr>
-              <w:t>时间节点截图</w:t>
+              <w:t>评级截图、数据记录</w:t>
             </w:r>
           </w:p>
         </w:tc>
@@ -7137,7 +7086,7 @@
                 <w:color w:val="172B3A"/>
                 <w:sz w:val="15"/>
               </w:rPr>
-              <w:t>DET-003</w:t>
+              <w:t>DET-006</w:t>
             </w:r>
           </w:p>
         </w:tc>
@@ -7188,7 +7137,7 @@
                 <w:color w:val="172B3A"/>
                 <w:sz w:val="15"/>
               </w:rPr>
-              <w:t>形式、地点、时区、费用及未知/待公布状态表达明确。</w:t>
+              <w:t>含金量为独立指标并展示主办方、认可范围、持续时间和影响证据。</w:t>
             </w:r>
           </w:p>
         </w:tc>
@@ -7213,7 +7162,7 @@
                 <w:color w:val="172B3A"/>
                 <w:sz w:val="15"/>
               </w:rPr>
-              <w:t>验证线上、线下、混合、跨时区和未知值。</w:t>
+              <w:t>核对高/中/低样本及证据链接。</w:t>
             </w:r>
           </w:p>
         </w:tc>
@@ -7238,7 +7187,7 @@
                 <w:color w:val="172B3A"/>
                 <w:sz w:val="15"/>
               </w:rPr>
-              <w:t>场景截图</w:t>
+              <w:t>评级依据记录</w:t>
             </w:r>
           </w:p>
         </w:tc>
@@ -7339,7 +7288,7 @@
                 <w:color w:val="172B3A"/>
                 <w:sz w:val="15"/>
               </w:rPr>
-              <w:t>DET-004</w:t>
+              <w:t>DET-007</w:t>
             </w:r>
           </w:p>
         </w:tc>
@@ -7390,7 +7339,7 @@
                 <w:color w:val="172B3A"/>
                 <w:sz w:val="15"/>
               </w:rPr>
-              <w:t>官网、报名页和下载/填写/上传材料清单完整；附件只链接官网下载。</w:t>
+              <w:t>支持本地备注、参赛计划、任务清单、完成状态和来源变更历史。</w:t>
             </w:r>
           </w:p>
         </w:tc>
@@ -7415,7 +7364,7 @@
                 <w:color w:val="172B3A"/>
                 <w:sz w:val="15"/>
               </w:rPr>
-              <w:t>逐链接打开并确认未缓存第三方附件。</w:t>
+              <w:t>创建、编辑、重启、更新后核对。</w:t>
             </w:r>
           </w:p>
         </w:tc>
@@ -7440,7 +7389,7 @@
                 <w:color w:val="172B3A"/>
                 <w:sz w:val="15"/>
               </w:rPr>
-              <w:t>链接检查报告</w:t>
+              <w:t>本地数据截图</w:t>
             </w:r>
           </w:p>
         </w:tc>
@@ -7541,7 +7490,7 @@
                 <w:color w:val="172B3A"/>
                 <w:sz w:val="15"/>
               </w:rPr>
-              <w:t>DET-005</w:t>
+              <w:t>SEA-001</w:t>
             </w:r>
           </w:p>
         </w:tc>
@@ -7592,7 +7541,7 @@
                 <w:color w:val="172B3A"/>
                 <w:sz w:val="15"/>
               </w:rPr>
-              <w:t>难度星级有证据、充分度和暂无评级状态；允许设置个人星级且不覆盖系统评级。</w:t>
+              <w:t>搜索覆盖名称、届次、主办方、简介、专业、材料名称和别名。</w:t>
             </w:r>
           </w:p>
         </w:tc>
@@ -7617,7 +7566,7 @@
                 <w:color w:val="172B3A"/>
                 <w:sz w:val="15"/>
               </w:rPr>
-              <w:t>验证有证据、无证据和个人修改场景。</w:t>
+              <w:t>对每个索引字段执行命中与不命中测试。</w:t>
             </w:r>
           </w:p>
         </w:tc>
@@ -7642,7 +7591,7 @@
                 <w:color w:val="172B3A"/>
                 <w:sz w:val="15"/>
               </w:rPr>
-              <w:t>评级截图、数据记录</w:t>
+              <w:t>搜索用例报告</w:t>
             </w:r>
           </w:p>
         </w:tc>
@@ -7743,7 +7692,7 @@
                 <w:color w:val="172B3A"/>
                 <w:sz w:val="15"/>
               </w:rPr>
-              <w:t>DET-006</w:t>
+              <w:t>SEA-002</w:t>
             </w:r>
           </w:p>
         </w:tc>
@@ -7769,7 +7718,7 @@
                 <w:color w:val="172B3A"/>
                 <w:sz w:val="15"/>
               </w:rPr>
-              <w:t>P0</w:t>
+              <w:t>P1</w:t>
             </w:r>
           </w:p>
         </w:tc>
@@ -7794,7 +7743,7 @@
                 <w:color w:val="172B3A"/>
                 <w:sz w:val="15"/>
               </w:rPr>
-              <w:t>含金量为独立指标并展示主办方、认可范围、持续时间和影响证据。</w:t>
+              <w:t>支持拼音、英文名、常见缩写及大小写不敏感搜索。</w:t>
             </w:r>
           </w:p>
         </w:tc>
@@ -7819,7 +7768,7 @@
                 <w:color w:val="172B3A"/>
                 <w:sz w:val="15"/>
               </w:rPr>
-              <w:t>核对高/中/低样本及证据链接。</w:t>
+              <w:t>执行中英、全拼、首字母和缩写样本。</w:t>
             </w:r>
           </w:p>
         </w:tc>
@@ -7844,7 +7793,7 @@
                 <w:color w:val="172B3A"/>
                 <w:sz w:val="15"/>
               </w:rPr>
-              <w:t>评级依据记录</w:t>
+              <w:t>搜索截图</w:t>
             </w:r>
           </w:p>
         </w:tc>
@@ -7945,7 +7894,7 @@
                 <w:color w:val="172B3A"/>
                 <w:sz w:val="15"/>
               </w:rPr>
-              <w:t>DET-007</w:t>
+              <w:t>SEA-003</w:t>
             </w:r>
           </w:p>
         </w:tc>
@@ -7996,7 +7945,7 @@
                 <w:color w:val="172B3A"/>
                 <w:sz w:val="15"/>
               </w:rPr>
-              <w:t>支持本地备注、参赛计划、任务清单、完成状态和来源变更历史。</w:t>
+              <w:t>专业、状态、对象、主办方类型、难度、含金量、收藏、形式、费用、年份、审核状态可组合筛选。</w:t>
             </w:r>
           </w:p>
         </w:tc>
@@ -8021,7 +7970,7 @@
                 <w:color w:val="172B3A"/>
                 <w:sz w:val="15"/>
               </w:rPr>
-              <w:t>创建、编辑、重启、更新后核对。</w:t>
+              <w:t>覆盖单条件、交叉条件、重置和空结果。</w:t>
             </w:r>
           </w:p>
         </w:tc>
@@ -8046,7 +7995,7 @@
                 <w:color w:val="172B3A"/>
                 <w:sz w:val="15"/>
               </w:rPr>
-              <w:t>本地数据截图</w:t>
+              <w:t>筛选测试报告</w:t>
             </w:r>
           </w:p>
         </w:tc>
@@ -8147,7 +8096,7 @@
                 <w:color w:val="172B3A"/>
                 <w:sz w:val="15"/>
               </w:rPr>
-              <w:t>SEA-001</w:t>
+              <w:t>SEA-004</w:t>
             </w:r>
           </w:p>
         </w:tc>
@@ -8198,7 +8147,7 @@
                 <w:color w:val="172B3A"/>
                 <w:sz w:val="15"/>
               </w:rPr>
-              <w:t>搜索覆盖名称、届次、主办方、简介、专业、材料名称和别名。</w:t>
+              <w:t>支持截止、更新时间、难度、含金量和公开热度排序。</w:t>
             </w:r>
           </w:p>
         </w:tc>
@@ -8223,7 +8172,7 @@
                 <w:color w:val="172B3A"/>
                 <w:sz w:val="15"/>
               </w:rPr>
-              <w:t>对每个索引字段执行命中与不命中测试。</w:t>
+              <w:t>构造已知顺序数据并逐项验证。</w:t>
             </w:r>
           </w:p>
         </w:tc>
@@ -8248,7 +8197,7 @@
                 <w:color w:val="172B3A"/>
                 <w:sz w:val="15"/>
               </w:rPr>
-              <w:t>搜索用例报告</w:t>
+              <w:t>排序断言报告</w:t>
             </w:r>
           </w:p>
         </w:tc>
@@ -8349,7 +8298,7 @@
                 <w:color w:val="172B3A"/>
                 <w:sz w:val="15"/>
               </w:rPr>
-              <w:t>SEA-002</w:t>
+              <w:t>SEA-005</w:t>
             </w:r>
           </w:p>
         </w:tc>
@@ -8375,7 +8324,7 @@
                 <w:color w:val="172B3A"/>
                 <w:sz w:val="15"/>
               </w:rPr>
-              <w:t>P1</w:t>
+              <w:t>P0</w:t>
             </w:r>
           </w:p>
         </w:tc>
@@ -8400,7 +8349,7 @@
                 <w:color w:val="172B3A"/>
                 <w:sz w:val="15"/>
               </w:rPr>
-              <w:t>支持拼音、英文名、常见缩写及大小写不敏感搜索。</w:t>
+              <w:t>10,000条本地数据下首屏搜索响应≤150ms。</w:t>
             </w:r>
           </w:p>
         </w:tc>
@@ -8425,7 +8374,7 @@
                 <w:color w:val="172B3A"/>
                 <w:sz w:val="15"/>
               </w:rPr>
-              <w:t>执行中英、全拼、首字母和缩写样本。</w:t>
+              <w:t>冷、热缓存各运行30次并报告P50/P95。</w:t>
             </w:r>
           </w:p>
         </w:tc>
@@ -8450,7 +8399,7 @@
                 <w:color w:val="172B3A"/>
                 <w:sz w:val="15"/>
               </w:rPr>
-              <w:t>搜索截图</w:t>
+              <w:t>性能报告</w:t>
             </w:r>
           </w:p>
         </w:tc>
@@ -8551,7 +8500,7 @@
                 <w:color w:val="172B3A"/>
                 <w:sz w:val="15"/>
               </w:rPr>
-              <w:t>SEA-003</w:t>
+              <w:t>CAL-001</w:t>
             </w:r>
           </w:p>
         </w:tc>
@@ -8602,7 +8551,7 @@
                 <w:color w:val="172B3A"/>
                 <w:sz w:val="15"/>
               </w:rPr>
-              <w:t>专业、状态、对象、主办方类型、难度、含金量、收藏、提醒、形式、费用、年份、审核状态可组合筛选。</w:t>
+              <w:t>月历展示报名、初赛、复赛、决赛和结果节点，并支持按竞赛和节点类型筛选。</w:t>
             </w:r>
           </w:p>
         </w:tc>
@@ -8627,7 +8576,7 @@
                 <w:color w:val="172B3A"/>
                 <w:sz w:val="15"/>
               </w:rPr>
-              <w:t>覆盖单条件、交叉条件、重置和空结果。</w:t>
+              <w:t>检查多阶段竞赛跨月显示。</w:t>
             </w:r>
           </w:p>
         </w:tc>
@@ -8652,7 +8601,7 @@
                 <w:color w:val="172B3A"/>
                 <w:sz w:val="15"/>
               </w:rPr>
-              <w:t>筛选测试报告</w:t>
+              <w:t>日历截图</w:t>
             </w:r>
           </w:p>
         </w:tc>
@@ -8753,7 +8702,7 @@
                 <w:color w:val="172B3A"/>
                 <w:sz w:val="15"/>
               </w:rPr>
-              <w:t>SEA-004</w:t>
+              <w:t>CAL-002</w:t>
             </w:r>
           </w:p>
         </w:tc>
@@ -8779,7 +8728,7 @@
                 <w:color w:val="172B3A"/>
                 <w:sz w:val="15"/>
               </w:rPr>
-              <w:t>P0</w:t>
+              <w:t>P1</w:t>
             </w:r>
           </w:p>
         </w:tc>
@@ -8804,7 +8753,7 @@
                 <w:color w:val="172B3A"/>
                 <w:sz w:val="15"/>
               </w:rPr>
-              <w:t>支持截止、更新时间、难度、含金量和公开热度排序。</w:t>
+              <w:t>支持今天、前后月份、年份选择、事件详情和详情页反向跳转。</w:t>
             </w:r>
           </w:p>
         </w:tc>
@@ -8829,7 +8778,7 @@
                 <w:color w:val="172B3A"/>
                 <w:sz w:val="15"/>
               </w:rPr>
-              <w:t>构造已知顺序数据并逐项验证。</w:t>
+              <w:t>鼠标和键盘完成全部导航路径。</w:t>
             </w:r>
           </w:p>
         </w:tc>
@@ -8854,7 +8803,7 @@
                 <w:color w:val="172B3A"/>
                 <w:sz w:val="15"/>
               </w:rPr>
-              <w:t>排序断言报告</w:t>
+              <w:t>交互录像</w:t>
             </w:r>
           </w:p>
         </w:tc>
@@ -8955,7 +8904,7 @@
                 <w:color w:val="172B3A"/>
                 <w:sz w:val="15"/>
               </w:rPr>
-              <w:t>SEA-005</w:t>
+              <w:t>LOC-001</w:t>
             </w:r>
           </w:p>
         </w:tc>
@@ -9006,7 +8955,7 @@
                 <w:color w:val="172B3A"/>
                 <w:sz w:val="15"/>
               </w:rPr>
-              <w:t>10,000条本地数据下首屏搜索响应≤150ms。</w:t>
+              <w:t>收藏、隐藏、备注和计划均本地持久化，重启不丢失。</w:t>
             </w:r>
           </w:p>
         </w:tc>
@@ -9031,7 +8980,7 @@
                 <w:color w:val="172B3A"/>
                 <w:sz w:val="15"/>
               </w:rPr>
-              <w:t>冷、热缓存各运行30次并报告P50/P95。</w:t>
+              <w:t>写入数据、结束进程并重启验证。</w:t>
             </w:r>
           </w:p>
         </w:tc>
@@ -9056,7 +9005,7 @@
                 <w:color w:val="172B3A"/>
                 <w:sz w:val="15"/>
               </w:rPr>
-              <w:t>性能报告</w:t>
+              <w:t>持久化测试日志</w:t>
             </w:r>
           </w:p>
         </w:tc>
@@ -9157,7 +9106,7 @@
                 <w:color w:val="172B3A"/>
                 <w:sz w:val="15"/>
               </w:rPr>
-              <w:t>CAL-001</w:t>
+              <w:t>LOC-002</w:t>
             </w:r>
           </w:p>
         </w:tc>
@@ -9208,7 +9157,7 @@
                 <w:color w:val="172B3A"/>
                 <w:sz w:val="15"/>
               </w:rPr>
-              <w:t>月历展示报名、初赛、复赛、决赛和结果节点，并支持按竞赛和节点类型筛选。</w:t>
+              <w:t>隐藏支持即时撤销和已隐藏列表恢复。</w:t>
             </w:r>
           </w:p>
         </w:tc>
@@ -9233,7 +9182,7 @@
                 <w:color w:val="172B3A"/>
                 <w:sz w:val="15"/>
               </w:rPr>
-              <w:t>检查多阶段竞赛跨月显示。</w:t>
+              <w:t>隐藏、撤销、重启、恢复各一次。</w:t>
             </w:r>
           </w:p>
         </w:tc>
@@ -9258,7 +9207,7 @@
                 <w:color w:val="172B3A"/>
                 <w:sz w:val="15"/>
               </w:rPr>
-              <w:t>日历截图</w:t>
+              <w:t>交互截图</w:t>
             </w:r>
           </w:p>
         </w:tc>
@@ -9359,7 +9308,7 @@
                 <w:color w:val="172B3A"/>
                 <w:sz w:val="15"/>
               </w:rPr>
-              <w:t>CAL-002</w:t>
+              <w:t>I18-001</w:t>
             </w:r>
           </w:p>
         </w:tc>
@@ -9385,7 +9334,7 @@
                 <w:color w:val="172B3A"/>
                 <w:sz w:val="15"/>
               </w:rPr>
-              <w:t>P1</w:t>
+              <w:t>P0</w:t>
             </w:r>
           </w:p>
         </w:tc>
@@ -9410,7 +9359,7 @@
                 <w:color w:val="172B3A"/>
                 <w:sz w:val="15"/>
               </w:rPr>
-              <w:t>支持今天、前后月份、年份选择、事件详情和详情页反向跳转。</w:t>
+              <w:t>界面、错误、空状态、设置、评级和帮助内容100%双语。</w:t>
             </w:r>
           </w:p>
         </w:tc>
@@ -9435,7 +9384,7 @@
                 <w:color w:val="172B3A"/>
                 <w:sz w:val="15"/>
               </w:rPr>
-              <w:t>鼠标和键盘完成全部导航路径。</w:t>
+              <w:t>自动扫描硬编码文案并人工遍历全页面。</w:t>
             </w:r>
           </w:p>
         </w:tc>
@@ -9460,7 +9409,7 @@
                 <w:color w:val="172B3A"/>
                 <w:sz w:val="15"/>
               </w:rPr>
-              <w:t>交互录像</w:t>
+              <w:t>双语覆盖报告</w:t>
             </w:r>
           </w:p>
         </w:tc>
@@ -9561,7 +9510,7 @@
                 <w:color w:val="172B3A"/>
                 <w:sz w:val="15"/>
               </w:rPr>
-              <w:t>LOC-001</w:t>
+              <w:t>I18-002</w:t>
             </w:r>
           </w:p>
         </w:tc>
@@ -9612,7 +9561,7 @@
                 <w:color w:val="172B3A"/>
                 <w:sz w:val="15"/>
               </w:rPr>
-              <w:t>收藏、隐藏、提醒、备注和计划均本地持久化，重启不丢失。</w:t>
+              <w:t>官方中文名保留时提供英文显示名或Official Chinese name标记。</w:t>
             </w:r>
           </w:p>
         </w:tc>
@@ -9637,7 +9586,7 @@
                 <w:color w:val="172B3A"/>
                 <w:sz w:val="15"/>
               </w:rPr>
-              <w:t>写入数据、结束进程并重启验证。</w:t>
+              <w:t>检查全部中文正式名称。</w:t>
             </w:r>
           </w:p>
         </w:tc>
@@ -9662,7 +9611,7 @@
                 <w:color w:val="172B3A"/>
                 <w:sz w:val="15"/>
               </w:rPr>
-              <w:t>持久化测试日志</w:t>
+              <w:t>字段完整性报告</w:t>
             </w:r>
           </w:p>
         </w:tc>
@@ -9763,7 +9712,7 @@
                 <w:color w:val="172B3A"/>
                 <w:sz w:val="15"/>
               </w:rPr>
-              <w:t>LOC-002</w:t>
+              <w:t>I18-003</w:t>
             </w:r>
           </w:p>
         </w:tc>
@@ -9814,7 +9763,7 @@
                 <w:color w:val="172B3A"/>
                 <w:sz w:val="15"/>
               </w:rPr>
-              <w:t>隐藏支持即时撤销和已隐藏列表恢复。</w:t>
+              <w:t>语言和主题选择重启后保留；深浅主题所有页面对比度合格。</w:t>
             </w:r>
           </w:p>
         </w:tc>
@@ -9839,7 +9788,7 @@
                 <w:color w:val="172B3A"/>
                 <w:sz w:val="15"/>
               </w:rPr>
-              <w:t>隐藏、撤销、重启、恢复各一次。</w:t>
+              <w:t>切换、重启并执行对比度扫描。</w:t>
             </w:r>
           </w:p>
         </w:tc>
@@ -9864,7 +9813,7 @@
                 <w:color w:val="172B3A"/>
                 <w:sz w:val="15"/>
               </w:rPr>
-              <w:t>交互截图</w:t>
+              <w:t>持久化与对比度报告</w:t>
             </w:r>
           </w:p>
         </w:tc>
@@ -9965,7 +9914,7 @@
                 <w:color w:val="172B3A"/>
                 <w:sz w:val="15"/>
               </w:rPr>
-              <w:t>REM-001</w:t>
+              <w:t>A11-001</w:t>
             </w:r>
           </w:p>
         </w:tc>
@@ -10016,7 +9965,7 @@
                 <w:color w:val="172B3A"/>
                 <w:sz w:val="15"/>
               </w:rPr>
-              <w:t>提醒支持30、15、5、1天默认规则及用户自定义时间。</w:t>
+              <w:t>Windows 125%、150%、175%、200%缩放无截断、消失或横向溢出。</w:t>
             </w:r>
           </w:p>
         </w:tc>
@@ -10041,7 +9990,7 @@
                 <w:color w:val="172B3A"/>
                 <w:sz w:val="15"/>
               </w:rPr>
-              <w:t>逐项创建、修改和触发。</w:t>
+              <w:t>各缩放比例遍历六个主页面。</w:t>
             </w:r>
           </w:p>
         </w:tc>
@@ -10066,7 +10015,7 @@
                 <w:color w:val="172B3A"/>
                 <w:sz w:val="15"/>
               </w:rPr>
-              <w:t>提醒测试记录</w:t>
+              <w:t>截图矩阵</w:t>
             </w:r>
           </w:p>
         </w:tc>
@@ -10167,7 +10116,7 @@
                 <w:color w:val="172B3A"/>
                 <w:sz w:val="15"/>
               </w:rPr>
-              <w:t>REM-002</w:t>
+              <w:t>A11-002</w:t>
             </w:r>
           </w:p>
         </w:tc>
@@ -10218,7 +10167,7 @@
                 <w:color w:val="172B3A"/>
                 <w:sz w:val="15"/>
               </w:rPr>
-              <w:t>提醒可添加、修改、暂停、取消、恢复；同一节点不重复提示。</w:t>
+              <w:t>满足WCAG 2.2 AA：键盘、焦点、语义、屏幕阅读器状态和主要44×44点击区域。</w:t>
             </w:r>
           </w:p>
         </w:tc>
@@ -10243,7 +10192,7 @@
                 <w:color w:val="172B3A"/>
                 <w:sz w:val="15"/>
               </w:rPr>
-              <w:t>执行状态机和重复启动测试。</w:t>
+              <w:t>axe扫描、键盘遍历和Narrator人工检查。</w:t>
             </w:r>
           </w:p>
         </w:tc>
@@ -10268,7 +10217,7 @@
                 <w:color w:val="172B3A"/>
                 <w:sz w:val="15"/>
               </w:rPr>
-              <w:t>状态转换日志</w:t>
+              <w:t>可访问性报告</w:t>
             </w:r>
           </w:p>
         </w:tc>
@@ -10369,7 +10318,7 @@
                 <w:color w:val="172B3A"/>
                 <w:sz w:val="15"/>
               </w:rPr>
-              <w:t>REM-003</w:t>
+              <w:t>A11-003</w:t>
             </w:r>
           </w:p>
         </w:tc>
@@ -10420,7 +10369,7 @@
                 <w:color w:val="172B3A"/>
                 <w:sz w:val="15"/>
               </w:rPr>
-              <w:t>系统时间、跨时区、错过提醒和日期更新后重新计算，并保留旧日期对照。</w:t>
+              <w:t>页签有选中状态，图标按钮有名称；无空函数、无反馈、按钮嵌套或仅颜色状态。</w:t>
             </w:r>
           </w:p>
         </w:tc>
@@ -10445,7 +10394,7 @@
                 <w:color w:val="172B3A"/>
                 <w:sz w:val="15"/>
               </w:rPr>
-              <w:t>模拟时钟、时区和远端日期变更。</w:t>
+              <w:t>静态扫描结合全按钮点击巡检。</w:t>
             </w:r>
           </w:p>
         </w:tc>
@@ -10470,7 +10419,7 @@
                 <w:color w:val="172B3A"/>
                 <w:sz w:val="15"/>
               </w:rPr>
-              <w:t>重算日志、变更通知</w:t>
+              <w:t>无效控件报告</w:t>
             </w:r>
           </w:p>
         </w:tc>
@@ -10571,7 +10520,7 @@
                 <w:color w:val="172B3A"/>
                 <w:sz w:val="15"/>
               </w:rPr>
-              <w:t>I18-001</w:t>
+              <w:t>INS-001</w:t>
             </w:r>
           </w:p>
         </w:tc>
@@ -10622,7 +10571,7 @@
                 <w:color w:val="172B3A"/>
                 <w:sz w:val="15"/>
               </w:rPr>
-              <w:t>界面、错误、空状态、设置、评级和帮助内容100%双语。</w:t>
+              <w:t>Windows 10/11 x64支持全新安装、覆盖升级、卸载和重装。</w:t>
             </w:r>
           </w:p>
         </w:tc>
@@ -10647,7 +10596,7 @@
                 <w:color w:val="172B3A"/>
                 <w:sz w:val="15"/>
               </w:rPr>
-              <w:t>自动扫描硬编码文案并人工遍历全页面。</w:t>
+              <w:t>两套干净虚拟机执行完整生命周期。</w:t>
             </w:r>
           </w:p>
         </w:tc>
@@ -10672,7 +10621,7 @@
                 <w:color w:val="172B3A"/>
                 <w:sz w:val="15"/>
               </w:rPr>
-              <w:t>双语覆盖报告</w:t>
+              <w:t>安装录像、系统日志</w:t>
             </w:r>
           </w:p>
         </w:tc>
@@ -10773,7 +10722,7 @@
                 <w:color w:val="172B3A"/>
                 <w:sz w:val="15"/>
               </w:rPr>
-              <w:t>I18-002</w:t>
+              <w:t>INS-002</w:t>
             </w:r>
           </w:p>
         </w:tc>
@@ -10824,7 +10773,7 @@
                 <w:color w:val="172B3A"/>
                 <w:sz w:val="15"/>
               </w:rPr>
-              <w:t>官方中文名保留时提供英文显示名或Official Chinese name标记。</w:t>
+              <w:t>应用和数据包均数字签名、校验完整性并支持失败回滚。</w:t>
             </w:r>
           </w:p>
         </w:tc>
@@ -10849,7 +10798,7 @@
                 <w:color w:val="172B3A"/>
                 <w:sz w:val="15"/>
               </w:rPr>
-              <w:t>检查全部中文正式名称。</w:t>
+              <w:t>篡改安装包和数据包后验证拒绝与回滚。</w:t>
             </w:r>
           </w:p>
         </w:tc>
@@ -10874,7 +10823,7 @@
                 <w:color w:val="172B3A"/>
                 <w:sz w:val="15"/>
               </w:rPr>
-              <w:t>字段完整性报告</w:t>
+              <w:t>签名与回滚日志</w:t>
             </w:r>
           </w:p>
         </w:tc>
@@ -10975,7 +10924,7 @@
                 <w:color w:val="172B3A"/>
                 <w:sz w:val="15"/>
               </w:rPr>
-              <w:t>I18-003</w:t>
+              <w:t>INS-003</w:t>
             </w:r>
           </w:p>
         </w:tc>
@@ -11026,7 +10975,7 @@
                 <w:color w:val="172B3A"/>
                 <w:sz w:val="15"/>
               </w:rPr>
-              <w:t>语言和主题选择重启后保留；深浅主题所有页面对比度合格。</w:t>
+              <w:t>自动更新支持检查、下载、安装、重启和更新日志。</w:t>
             </w:r>
           </w:p>
         </w:tc>
@@ -11051,7 +11000,7 @@
                 <w:color w:val="172B3A"/>
                 <w:sz w:val="15"/>
               </w:rPr>
-              <w:t>切换、重启并执行对比度扫描。</w:t>
+              <w:t>从上一正式版升级到候选版。</w:t>
             </w:r>
           </w:p>
         </w:tc>
@@ -11076,7 +11025,7 @@
                 <w:color w:val="172B3A"/>
                 <w:sz w:val="15"/>
               </w:rPr>
-              <w:t>持久化与对比度报告</w:t>
+              <w:t>升级录像、更新日志</w:t>
             </w:r>
           </w:p>
         </w:tc>
@@ -11177,7 +11126,7 @@
                 <w:color w:val="172B3A"/>
                 <w:sz w:val="15"/>
               </w:rPr>
-              <w:t>A11-001</w:t>
+              <w:t>MIG-001</w:t>
             </w:r>
           </w:p>
         </w:tc>
@@ -11228,7 +11177,7 @@
                 <w:color w:val="172B3A"/>
                 <w:sz w:val="15"/>
               </w:rPr>
-              <w:t>Windows 125%、150%、175%、200%缩放无截断、消失或横向溢出。</w:t>
+              <w:t>数据迁移前自动备份；迁移失败恢复收藏、备注、计划和隐藏状态。</w:t>
             </w:r>
           </w:p>
         </w:tc>
@@ -11253,7 +11202,7 @@
                 <w:color w:val="172B3A"/>
                 <w:sz w:val="15"/>
               </w:rPr>
-              <w:t>各缩放比例遍历六个主页面。</w:t>
+              <w:t>注入迁移失败并核对前后数据哈希。</w:t>
             </w:r>
           </w:p>
         </w:tc>
@@ -11278,7 +11227,7 @@
                 <w:color w:val="172B3A"/>
                 <w:sz w:val="15"/>
               </w:rPr>
-              <w:t>截图矩阵</w:t>
+              <w:t>迁移与恢复报告</w:t>
             </w:r>
           </w:p>
         </w:tc>
@@ -11379,7 +11328,7 @@
                 <w:color w:val="172B3A"/>
                 <w:sz w:val="15"/>
               </w:rPr>
-              <w:t>A11-002</w:t>
+              <w:t>SEC-001</w:t>
             </w:r>
           </w:p>
         </w:tc>
@@ -11430,7 +11379,7 @@
                 <w:color w:val="172B3A"/>
                 <w:sz w:val="15"/>
               </w:rPr>
-              <w:t>满足WCAG 2.2 AA：键盘、焦点、语义、屏幕阅读器状态和主要44×44点击区域。</w:t>
+              <w:t>外链仅允许已登记HTTPS官方域名；非法协议和未登记域名被阻止。</w:t>
             </w:r>
           </w:p>
         </w:tc>
@@ -11455,7 +11404,7 @@
                 <w:color w:val="172B3A"/>
                 <w:sz w:val="15"/>
               </w:rPr>
-              <w:t>axe扫描、键盘遍历和Narrator人工检查。</w:t>
+              <w:t>测试http、file、javascript及未知域名。</w:t>
             </w:r>
           </w:p>
         </w:tc>
@@ -11480,7 +11429,7 @@
                 <w:color w:val="172B3A"/>
                 <w:sz w:val="15"/>
               </w:rPr>
-              <w:t>可访问性报告</w:t>
+              <w:t>安全测试报告</w:t>
             </w:r>
           </w:p>
         </w:tc>
@@ -11581,7 +11530,7 @@
                 <w:color w:val="172B3A"/>
                 <w:sz w:val="15"/>
               </w:rPr>
-              <w:t>A11-003</w:t>
+              <w:t>PRI-001</w:t>
             </w:r>
           </w:p>
         </w:tc>
@@ -11632,7 +11581,7 @@
                 <w:color w:val="172B3A"/>
                 <w:sz w:val="15"/>
               </w:rPr>
-              <w:t>页签有选中状态，图标按钮有名称；无空函数、无反馈、按钮嵌套或仅颜色状态。</w:t>
+              <w:t>收藏、备注、计划和隐藏状态不上传。</w:t>
             </w:r>
           </w:p>
         </w:tc>
@@ -11657,7 +11606,7 @@
                 <w:color w:val="172B3A"/>
                 <w:sz w:val="15"/>
               </w:rPr>
-              <w:t>静态扫描结合全按钮点击巡检。</w:t>
+              <w:t>抓包并检查应用数据流。</w:t>
             </w:r>
           </w:p>
         </w:tc>
@@ -11682,1421 +11631,7 @@
                 <w:color w:val="172B3A"/>
                 <w:sz w:val="15"/>
               </w:rPr>
-              <w:t>无效控件报告</w:t>
-            </w:r>
-          </w:p>
-        </w:tc>
-        <w:tc>
-          <w:tcPr>
-            <w:tcW w:type="dxa" w:w="1800"/>
-            <w:vAlign w:val="center"/>
-            <w:tcMar>
-              <w:top w:w="80" w:type="dxa"/>
-              <w:start w:w="120" w:type="dxa"/>
-              <w:bottom w:w="80" w:type="dxa"/>
-              <w:end w:w="120" w:type="dxa"/>
-            </w:tcMar>
-          </w:tcPr>
-          <w:p>
-            <w:pPr>
-              <w:spacing w:after="0" w:line="252" w:lineRule="auto"/>
-            </w:pPr>
-            <w:r>
-              <w:rPr>
-                <w:rFonts w:ascii="Calibri" w:hAnsi="Calibri" w:eastAsia="Microsoft YaHei"/>
-                <w:color w:val="172B3A"/>
-                <w:sz w:val="15"/>
-              </w:rPr>
-            </w:r>
-          </w:p>
-        </w:tc>
-        <w:tc>
-          <w:tcPr>
-            <w:tcW w:type="dxa" w:w="1200"/>
-            <w:vAlign w:val="center"/>
-            <w:tcMar>
-              <w:top w:w="80" w:type="dxa"/>
-              <w:start w:w="120" w:type="dxa"/>
-              <w:bottom w:w="80" w:type="dxa"/>
-              <w:end w:w="120" w:type="dxa"/>
-            </w:tcMar>
-          </w:tcPr>
-          <w:p>
-            <w:pPr>
-              <w:spacing w:after="0" w:line="252" w:lineRule="auto"/>
-            </w:pPr>
-            <w:r>
-              <w:rPr>
-                <w:rFonts w:ascii="Calibri" w:hAnsi="Calibri" w:eastAsia="Microsoft YaHei"/>
-                <w:color w:val="172B3A"/>
-                <w:sz w:val="15"/>
-              </w:rPr>
-            </w:r>
-          </w:p>
-        </w:tc>
-        <w:tc>
-          <w:tcPr>
-            <w:tcW w:type="dxa" w:w="1500"/>
-            <w:vAlign w:val="center"/>
-            <w:tcMar>
-              <w:top w:w="80" w:type="dxa"/>
-              <w:start w:w="120" w:type="dxa"/>
-              <w:bottom w:w="80" w:type="dxa"/>
-              <w:end w:w="120" w:type="dxa"/>
-            </w:tcMar>
-          </w:tcPr>
-          <w:p>
-            <w:pPr>
-              <w:spacing w:after="0" w:line="252" w:lineRule="auto"/>
-            </w:pPr>
-            <w:r>
-              <w:rPr>
-                <w:rFonts w:ascii="Calibri" w:hAnsi="Calibri" w:eastAsia="Microsoft YaHei"/>
-                <w:color w:val="172B3A"/>
-                <w:sz w:val="15"/>
-              </w:rPr>
-              <w:t>□通过 □失败</w:t>
-            </w:r>
-          </w:p>
-        </w:tc>
-      </w:tr>
-      <w:tr>
-        <w:tc>
-          <w:tcPr>
-            <w:tcW w:type="dxa" w:w="900"/>
-            <w:vAlign w:val="center"/>
-            <w:tcMar>
-              <w:top w:w="80" w:type="dxa"/>
-              <w:start w:w="120" w:type="dxa"/>
-              <w:bottom w:w="80" w:type="dxa"/>
-              <w:end w:w="120" w:type="dxa"/>
-            </w:tcMar>
-          </w:tcPr>
-          <w:p>
-            <w:pPr>
-              <w:spacing w:after="0" w:line="252" w:lineRule="auto"/>
-              <w:jc w:val="center"/>
-            </w:pPr>
-            <w:r>
-              <w:rPr>
-                <w:rFonts w:ascii="Calibri" w:hAnsi="Calibri" w:eastAsia="Microsoft YaHei"/>
-                <w:color w:val="172B3A"/>
-                <w:sz w:val="15"/>
-              </w:rPr>
-              <w:t>INS-001</w:t>
-            </w:r>
-          </w:p>
-        </w:tc>
-        <w:tc>
-          <w:tcPr>
-            <w:tcW w:type="dxa" w:w="720"/>
-            <w:vAlign w:val="center"/>
-            <w:tcMar>
-              <w:top w:w="80" w:type="dxa"/>
-              <w:start w:w="120" w:type="dxa"/>
-              <w:bottom w:w="80" w:type="dxa"/>
-              <w:end w:w="120" w:type="dxa"/>
-            </w:tcMar>
-          </w:tcPr>
-          <w:p>
-            <w:pPr>
-              <w:spacing w:after="0" w:line="252" w:lineRule="auto"/>
-              <w:jc w:val="center"/>
-            </w:pPr>
-            <w:r>
-              <w:rPr>
-                <w:rFonts w:ascii="Calibri" w:hAnsi="Calibri" w:eastAsia="Microsoft YaHei"/>
-                <w:color w:val="172B3A"/>
-                <w:sz w:val="15"/>
-              </w:rPr>
-              <w:t>P0</w:t>
-            </w:r>
-          </w:p>
-        </w:tc>
-        <w:tc>
-          <w:tcPr>
-            <w:tcW w:type="dxa" w:w="3600"/>
-            <w:vAlign w:val="center"/>
-            <w:tcMar>
-              <w:top w:w="80" w:type="dxa"/>
-              <w:start w:w="120" w:type="dxa"/>
-              <w:bottom w:w="80" w:type="dxa"/>
-              <w:end w:w="120" w:type="dxa"/>
-            </w:tcMar>
-          </w:tcPr>
-          <w:p>
-            <w:pPr>
-              <w:spacing w:after="0" w:line="252" w:lineRule="auto"/>
-            </w:pPr>
-            <w:r>
-              <w:rPr>
-                <w:rFonts w:ascii="Calibri" w:hAnsi="Calibri" w:eastAsia="Microsoft YaHei"/>
-                <w:color w:val="172B3A"/>
-                <w:sz w:val="15"/>
-              </w:rPr>
-              <w:t>Windows 10/11 x64支持全新安装、覆盖升级、卸载和重装。</w:t>
-            </w:r>
-          </w:p>
-        </w:tc>
-        <w:tc>
-          <w:tcPr>
-            <w:tcW w:type="dxa" w:w="3000"/>
-            <w:vAlign w:val="center"/>
-            <w:tcMar>
-              <w:top w:w="80" w:type="dxa"/>
-              <w:start w:w="120" w:type="dxa"/>
-              <w:bottom w:w="80" w:type="dxa"/>
-              <w:end w:w="120" w:type="dxa"/>
-            </w:tcMar>
-          </w:tcPr>
-          <w:p>
-            <w:pPr>
-              <w:spacing w:after="0" w:line="252" w:lineRule="auto"/>
-            </w:pPr>
-            <w:r>
-              <w:rPr>
-                <w:rFonts w:ascii="Calibri" w:hAnsi="Calibri" w:eastAsia="Microsoft YaHei"/>
-                <w:color w:val="172B3A"/>
-                <w:sz w:val="15"/>
-              </w:rPr>
-              <w:t>两套干净虚拟机执行完整生命周期。</w:t>
-            </w:r>
-          </w:p>
-        </w:tc>
-        <w:tc>
-          <w:tcPr>
-            <w:tcW w:type="dxa" w:w="1800"/>
-            <w:vAlign w:val="center"/>
-            <w:tcMar>
-              <w:top w:w="80" w:type="dxa"/>
-              <w:start w:w="120" w:type="dxa"/>
-              <w:bottom w:w="80" w:type="dxa"/>
-              <w:end w:w="120" w:type="dxa"/>
-            </w:tcMar>
-          </w:tcPr>
-          <w:p>
-            <w:pPr>
-              <w:spacing w:after="0" w:line="252" w:lineRule="auto"/>
-            </w:pPr>
-            <w:r>
-              <w:rPr>
-                <w:rFonts w:ascii="Calibri" w:hAnsi="Calibri" w:eastAsia="Microsoft YaHei"/>
-                <w:color w:val="172B3A"/>
-                <w:sz w:val="15"/>
-              </w:rPr>
-              <w:t>安装录像、系统日志</w:t>
-            </w:r>
-          </w:p>
-        </w:tc>
-        <w:tc>
-          <w:tcPr>
-            <w:tcW w:type="dxa" w:w="1800"/>
-            <w:vAlign w:val="center"/>
-            <w:tcMar>
-              <w:top w:w="80" w:type="dxa"/>
-              <w:start w:w="120" w:type="dxa"/>
-              <w:bottom w:w="80" w:type="dxa"/>
-              <w:end w:w="120" w:type="dxa"/>
-            </w:tcMar>
-          </w:tcPr>
-          <w:p>
-            <w:pPr>
-              <w:spacing w:after="0" w:line="252" w:lineRule="auto"/>
-            </w:pPr>
-            <w:r>
-              <w:rPr>
-                <w:rFonts w:ascii="Calibri" w:hAnsi="Calibri" w:eastAsia="Microsoft YaHei"/>
-                <w:color w:val="172B3A"/>
-                <w:sz w:val="15"/>
-              </w:rPr>
-            </w:r>
-          </w:p>
-        </w:tc>
-        <w:tc>
-          <w:tcPr>
-            <w:tcW w:type="dxa" w:w="1200"/>
-            <w:vAlign w:val="center"/>
-            <w:tcMar>
-              <w:top w:w="80" w:type="dxa"/>
-              <w:start w:w="120" w:type="dxa"/>
-              <w:bottom w:w="80" w:type="dxa"/>
-              <w:end w:w="120" w:type="dxa"/>
-            </w:tcMar>
-          </w:tcPr>
-          <w:p>
-            <w:pPr>
-              <w:spacing w:after="0" w:line="252" w:lineRule="auto"/>
-            </w:pPr>
-            <w:r>
-              <w:rPr>
-                <w:rFonts w:ascii="Calibri" w:hAnsi="Calibri" w:eastAsia="Microsoft YaHei"/>
-                <w:color w:val="172B3A"/>
-                <w:sz w:val="15"/>
-              </w:rPr>
-            </w:r>
-          </w:p>
-        </w:tc>
-        <w:tc>
-          <w:tcPr>
-            <w:tcW w:type="dxa" w:w="1500"/>
-            <w:vAlign w:val="center"/>
-            <w:tcMar>
-              <w:top w:w="80" w:type="dxa"/>
-              <w:start w:w="120" w:type="dxa"/>
-              <w:bottom w:w="80" w:type="dxa"/>
-              <w:end w:w="120" w:type="dxa"/>
-            </w:tcMar>
-          </w:tcPr>
-          <w:p>
-            <w:pPr>
-              <w:spacing w:after="0" w:line="252" w:lineRule="auto"/>
-            </w:pPr>
-            <w:r>
-              <w:rPr>
-                <w:rFonts w:ascii="Calibri" w:hAnsi="Calibri" w:eastAsia="Microsoft YaHei"/>
-                <w:color w:val="172B3A"/>
-                <w:sz w:val="15"/>
-              </w:rPr>
-              <w:t>□通过 □失败</w:t>
-            </w:r>
-          </w:p>
-        </w:tc>
-      </w:tr>
-      <w:tr>
-        <w:tc>
-          <w:tcPr>
-            <w:tcW w:type="dxa" w:w="900"/>
-            <w:vAlign w:val="center"/>
-            <w:tcMar>
-              <w:top w:w="80" w:type="dxa"/>
-              <w:start w:w="120" w:type="dxa"/>
-              <w:bottom w:w="80" w:type="dxa"/>
-              <w:end w:w="120" w:type="dxa"/>
-            </w:tcMar>
-          </w:tcPr>
-          <w:p>
-            <w:pPr>
-              <w:spacing w:after="0" w:line="252" w:lineRule="auto"/>
-              <w:jc w:val="center"/>
-            </w:pPr>
-            <w:r>
-              <w:rPr>
-                <w:rFonts w:ascii="Calibri" w:hAnsi="Calibri" w:eastAsia="Microsoft YaHei"/>
-                <w:color w:val="172B3A"/>
-                <w:sz w:val="15"/>
-              </w:rPr>
-              <w:t>INS-002</w:t>
-            </w:r>
-          </w:p>
-        </w:tc>
-        <w:tc>
-          <w:tcPr>
-            <w:tcW w:type="dxa" w:w="720"/>
-            <w:vAlign w:val="center"/>
-            <w:tcMar>
-              <w:top w:w="80" w:type="dxa"/>
-              <w:start w:w="120" w:type="dxa"/>
-              <w:bottom w:w="80" w:type="dxa"/>
-              <w:end w:w="120" w:type="dxa"/>
-            </w:tcMar>
-          </w:tcPr>
-          <w:p>
-            <w:pPr>
-              <w:spacing w:after="0" w:line="252" w:lineRule="auto"/>
-              <w:jc w:val="center"/>
-            </w:pPr>
-            <w:r>
-              <w:rPr>
-                <w:rFonts w:ascii="Calibri" w:hAnsi="Calibri" w:eastAsia="Microsoft YaHei"/>
-                <w:color w:val="172B3A"/>
-                <w:sz w:val="15"/>
-              </w:rPr>
-              <w:t>P0</w:t>
-            </w:r>
-          </w:p>
-        </w:tc>
-        <w:tc>
-          <w:tcPr>
-            <w:tcW w:type="dxa" w:w="3600"/>
-            <w:vAlign w:val="center"/>
-            <w:tcMar>
-              <w:top w:w="80" w:type="dxa"/>
-              <w:start w:w="120" w:type="dxa"/>
-              <w:bottom w:w="80" w:type="dxa"/>
-              <w:end w:w="120" w:type="dxa"/>
-            </w:tcMar>
-          </w:tcPr>
-          <w:p>
-            <w:pPr>
-              <w:spacing w:after="0" w:line="252" w:lineRule="auto"/>
-            </w:pPr>
-            <w:r>
-              <w:rPr>
-                <w:rFonts w:ascii="Calibri" w:hAnsi="Calibri" w:eastAsia="Microsoft YaHei"/>
-                <w:color w:val="172B3A"/>
-                <w:sz w:val="15"/>
-              </w:rPr>
-              <w:t>应用和数据包均数字签名、校验完整性并支持失败回滚。</w:t>
-            </w:r>
-          </w:p>
-        </w:tc>
-        <w:tc>
-          <w:tcPr>
-            <w:tcW w:type="dxa" w:w="3000"/>
-            <w:vAlign w:val="center"/>
-            <w:tcMar>
-              <w:top w:w="80" w:type="dxa"/>
-              <w:start w:w="120" w:type="dxa"/>
-              <w:bottom w:w="80" w:type="dxa"/>
-              <w:end w:w="120" w:type="dxa"/>
-            </w:tcMar>
-          </w:tcPr>
-          <w:p>
-            <w:pPr>
-              <w:spacing w:after="0" w:line="252" w:lineRule="auto"/>
-            </w:pPr>
-            <w:r>
-              <w:rPr>
-                <w:rFonts w:ascii="Calibri" w:hAnsi="Calibri" w:eastAsia="Microsoft YaHei"/>
-                <w:color w:val="172B3A"/>
-                <w:sz w:val="15"/>
-              </w:rPr>
-              <w:t>篡改安装包和数据包后验证拒绝与回滚。</w:t>
-            </w:r>
-          </w:p>
-        </w:tc>
-        <w:tc>
-          <w:tcPr>
-            <w:tcW w:type="dxa" w:w="1800"/>
-            <w:vAlign w:val="center"/>
-            <w:tcMar>
-              <w:top w:w="80" w:type="dxa"/>
-              <w:start w:w="120" w:type="dxa"/>
-              <w:bottom w:w="80" w:type="dxa"/>
-              <w:end w:w="120" w:type="dxa"/>
-            </w:tcMar>
-          </w:tcPr>
-          <w:p>
-            <w:pPr>
-              <w:spacing w:after="0" w:line="252" w:lineRule="auto"/>
-            </w:pPr>
-            <w:r>
-              <w:rPr>
-                <w:rFonts w:ascii="Calibri" w:hAnsi="Calibri" w:eastAsia="Microsoft YaHei"/>
-                <w:color w:val="172B3A"/>
-                <w:sz w:val="15"/>
-              </w:rPr>
-              <w:t>签名与回滚日志</w:t>
-            </w:r>
-          </w:p>
-        </w:tc>
-        <w:tc>
-          <w:tcPr>
-            <w:tcW w:type="dxa" w:w="1800"/>
-            <w:vAlign w:val="center"/>
-            <w:tcMar>
-              <w:top w:w="80" w:type="dxa"/>
-              <w:start w:w="120" w:type="dxa"/>
-              <w:bottom w:w="80" w:type="dxa"/>
-              <w:end w:w="120" w:type="dxa"/>
-            </w:tcMar>
-          </w:tcPr>
-          <w:p>
-            <w:pPr>
-              <w:spacing w:after="0" w:line="252" w:lineRule="auto"/>
-            </w:pPr>
-            <w:r>
-              <w:rPr>
-                <w:rFonts w:ascii="Calibri" w:hAnsi="Calibri" w:eastAsia="Microsoft YaHei"/>
-                <w:color w:val="172B3A"/>
-                <w:sz w:val="15"/>
-              </w:rPr>
-            </w:r>
-          </w:p>
-        </w:tc>
-        <w:tc>
-          <w:tcPr>
-            <w:tcW w:type="dxa" w:w="1200"/>
-            <w:vAlign w:val="center"/>
-            <w:tcMar>
-              <w:top w:w="80" w:type="dxa"/>
-              <w:start w:w="120" w:type="dxa"/>
-              <w:bottom w:w="80" w:type="dxa"/>
-              <w:end w:w="120" w:type="dxa"/>
-            </w:tcMar>
-          </w:tcPr>
-          <w:p>
-            <w:pPr>
-              <w:spacing w:after="0" w:line="252" w:lineRule="auto"/>
-            </w:pPr>
-            <w:r>
-              <w:rPr>
-                <w:rFonts w:ascii="Calibri" w:hAnsi="Calibri" w:eastAsia="Microsoft YaHei"/>
-                <w:color w:val="172B3A"/>
-                <w:sz w:val="15"/>
-              </w:rPr>
-            </w:r>
-          </w:p>
-        </w:tc>
-        <w:tc>
-          <w:tcPr>
-            <w:tcW w:type="dxa" w:w="1500"/>
-            <w:vAlign w:val="center"/>
-            <w:tcMar>
-              <w:top w:w="80" w:type="dxa"/>
-              <w:start w:w="120" w:type="dxa"/>
-              <w:bottom w:w="80" w:type="dxa"/>
-              <w:end w:w="120" w:type="dxa"/>
-            </w:tcMar>
-          </w:tcPr>
-          <w:p>
-            <w:pPr>
-              <w:spacing w:after="0" w:line="252" w:lineRule="auto"/>
-            </w:pPr>
-            <w:r>
-              <w:rPr>
-                <w:rFonts w:ascii="Calibri" w:hAnsi="Calibri" w:eastAsia="Microsoft YaHei"/>
-                <w:color w:val="172B3A"/>
-                <w:sz w:val="15"/>
-              </w:rPr>
-              <w:t>□通过 □失败</w:t>
-            </w:r>
-          </w:p>
-        </w:tc>
-      </w:tr>
-      <w:tr>
-        <w:tc>
-          <w:tcPr>
-            <w:tcW w:type="dxa" w:w="900"/>
-            <w:vAlign w:val="center"/>
-            <w:tcMar>
-              <w:top w:w="80" w:type="dxa"/>
-              <w:start w:w="120" w:type="dxa"/>
-              <w:bottom w:w="80" w:type="dxa"/>
-              <w:end w:w="120" w:type="dxa"/>
-            </w:tcMar>
-          </w:tcPr>
-          <w:p>
-            <w:pPr>
-              <w:spacing w:after="0" w:line="252" w:lineRule="auto"/>
-              <w:jc w:val="center"/>
-            </w:pPr>
-            <w:r>
-              <w:rPr>
-                <w:rFonts w:ascii="Calibri" w:hAnsi="Calibri" w:eastAsia="Microsoft YaHei"/>
-                <w:color w:val="172B3A"/>
-                <w:sz w:val="15"/>
-              </w:rPr>
-              <w:t>INS-003</w:t>
-            </w:r>
-          </w:p>
-        </w:tc>
-        <w:tc>
-          <w:tcPr>
-            <w:tcW w:type="dxa" w:w="720"/>
-            <w:vAlign w:val="center"/>
-            <w:tcMar>
-              <w:top w:w="80" w:type="dxa"/>
-              <w:start w:w="120" w:type="dxa"/>
-              <w:bottom w:w="80" w:type="dxa"/>
-              <w:end w:w="120" w:type="dxa"/>
-            </w:tcMar>
-          </w:tcPr>
-          <w:p>
-            <w:pPr>
-              <w:spacing w:after="0" w:line="252" w:lineRule="auto"/>
-              <w:jc w:val="center"/>
-            </w:pPr>
-            <w:r>
-              <w:rPr>
-                <w:rFonts w:ascii="Calibri" w:hAnsi="Calibri" w:eastAsia="Microsoft YaHei"/>
-                <w:color w:val="172B3A"/>
-                <w:sz w:val="15"/>
-              </w:rPr>
-              <w:t>P0</w:t>
-            </w:r>
-          </w:p>
-        </w:tc>
-        <w:tc>
-          <w:tcPr>
-            <w:tcW w:type="dxa" w:w="3600"/>
-            <w:vAlign w:val="center"/>
-            <w:tcMar>
-              <w:top w:w="80" w:type="dxa"/>
-              <w:start w:w="120" w:type="dxa"/>
-              <w:bottom w:w="80" w:type="dxa"/>
-              <w:end w:w="120" w:type="dxa"/>
-            </w:tcMar>
-          </w:tcPr>
-          <w:p>
-            <w:pPr>
-              <w:spacing w:after="0" w:line="252" w:lineRule="auto"/>
-            </w:pPr>
-            <w:r>
-              <w:rPr>
-                <w:rFonts w:ascii="Calibri" w:hAnsi="Calibri" w:eastAsia="Microsoft YaHei"/>
-                <w:color w:val="172B3A"/>
-                <w:sz w:val="15"/>
-              </w:rPr>
-              <w:t>自动更新支持检查、下载、安装、重启和更新日志。</w:t>
-            </w:r>
-          </w:p>
-        </w:tc>
-        <w:tc>
-          <w:tcPr>
-            <w:tcW w:type="dxa" w:w="3000"/>
-            <w:vAlign w:val="center"/>
-            <w:tcMar>
-              <w:top w:w="80" w:type="dxa"/>
-              <w:start w:w="120" w:type="dxa"/>
-              <w:bottom w:w="80" w:type="dxa"/>
-              <w:end w:w="120" w:type="dxa"/>
-            </w:tcMar>
-          </w:tcPr>
-          <w:p>
-            <w:pPr>
-              <w:spacing w:after="0" w:line="252" w:lineRule="auto"/>
-            </w:pPr>
-            <w:r>
-              <w:rPr>
-                <w:rFonts w:ascii="Calibri" w:hAnsi="Calibri" w:eastAsia="Microsoft YaHei"/>
-                <w:color w:val="172B3A"/>
-                <w:sz w:val="15"/>
-              </w:rPr>
-              <w:t>从上一正式版升级到候选版。</w:t>
-            </w:r>
-          </w:p>
-        </w:tc>
-        <w:tc>
-          <w:tcPr>
-            <w:tcW w:type="dxa" w:w="1800"/>
-            <w:vAlign w:val="center"/>
-            <w:tcMar>
-              <w:top w:w="80" w:type="dxa"/>
-              <w:start w:w="120" w:type="dxa"/>
-              <w:bottom w:w="80" w:type="dxa"/>
-              <w:end w:w="120" w:type="dxa"/>
-            </w:tcMar>
-          </w:tcPr>
-          <w:p>
-            <w:pPr>
-              <w:spacing w:after="0" w:line="252" w:lineRule="auto"/>
-            </w:pPr>
-            <w:r>
-              <w:rPr>
-                <w:rFonts w:ascii="Calibri" w:hAnsi="Calibri" w:eastAsia="Microsoft YaHei"/>
-                <w:color w:val="172B3A"/>
-                <w:sz w:val="15"/>
-              </w:rPr>
-              <w:t>升级录像、更新日志</w:t>
-            </w:r>
-          </w:p>
-        </w:tc>
-        <w:tc>
-          <w:tcPr>
-            <w:tcW w:type="dxa" w:w="1800"/>
-            <w:vAlign w:val="center"/>
-            <w:tcMar>
-              <w:top w:w="80" w:type="dxa"/>
-              <w:start w:w="120" w:type="dxa"/>
-              <w:bottom w:w="80" w:type="dxa"/>
-              <w:end w:w="120" w:type="dxa"/>
-            </w:tcMar>
-          </w:tcPr>
-          <w:p>
-            <w:pPr>
-              <w:spacing w:after="0" w:line="252" w:lineRule="auto"/>
-            </w:pPr>
-            <w:r>
-              <w:rPr>
-                <w:rFonts w:ascii="Calibri" w:hAnsi="Calibri" w:eastAsia="Microsoft YaHei"/>
-                <w:color w:val="172B3A"/>
-                <w:sz w:val="15"/>
-              </w:rPr>
-            </w:r>
-          </w:p>
-        </w:tc>
-        <w:tc>
-          <w:tcPr>
-            <w:tcW w:type="dxa" w:w="1200"/>
-            <w:vAlign w:val="center"/>
-            <w:tcMar>
-              <w:top w:w="80" w:type="dxa"/>
-              <w:start w:w="120" w:type="dxa"/>
-              <w:bottom w:w="80" w:type="dxa"/>
-              <w:end w:w="120" w:type="dxa"/>
-            </w:tcMar>
-          </w:tcPr>
-          <w:p>
-            <w:pPr>
-              <w:spacing w:after="0" w:line="252" w:lineRule="auto"/>
-            </w:pPr>
-            <w:r>
-              <w:rPr>
-                <w:rFonts w:ascii="Calibri" w:hAnsi="Calibri" w:eastAsia="Microsoft YaHei"/>
-                <w:color w:val="172B3A"/>
-                <w:sz w:val="15"/>
-              </w:rPr>
-            </w:r>
-          </w:p>
-        </w:tc>
-        <w:tc>
-          <w:tcPr>
-            <w:tcW w:type="dxa" w:w="1500"/>
-            <w:vAlign w:val="center"/>
-            <w:tcMar>
-              <w:top w:w="80" w:type="dxa"/>
-              <w:start w:w="120" w:type="dxa"/>
-              <w:bottom w:w="80" w:type="dxa"/>
-              <w:end w:w="120" w:type="dxa"/>
-            </w:tcMar>
-          </w:tcPr>
-          <w:p>
-            <w:pPr>
-              <w:spacing w:after="0" w:line="252" w:lineRule="auto"/>
-            </w:pPr>
-            <w:r>
-              <w:rPr>
-                <w:rFonts w:ascii="Calibri" w:hAnsi="Calibri" w:eastAsia="Microsoft YaHei"/>
-                <w:color w:val="172B3A"/>
-                <w:sz w:val="15"/>
-              </w:rPr>
-              <w:t>□通过 □失败</w:t>
-            </w:r>
-          </w:p>
-        </w:tc>
-      </w:tr>
-      <w:tr>
-        <w:tc>
-          <w:tcPr>
-            <w:tcW w:type="dxa" w:w="900"/>
-            <w:vAlign w:val="center"/>
-            <w:tcMar>
-              <w:top w:w="80" w:type="dxa"/>
-              <w:start w:w="120" w:type="dxa"/>
-              <w:bottom w:w="80" w:type="dxa"/>
-              <w:end w:w="120" w:type="dxa"/>
-            </w:tcMar>
-          </w:tcPr>
-          <w:p>
-            <w:pPr>
-              <w:spacing w:after="0" w:line="252" w:lineRule="auto"/>
-              <w:jc w:val="center"/>
-            </w:pPr>
-            <w:r>
-              <w:rPr>
-                <w:rFonts w:ascii="Calibri" w:hAnsi="Calibri" w:eastAsia="Microsoft YaHei"/>
-                <w:color w:val="172B3A"/>
-                <w:sz w:val="15"/>
-              </w:rPr>
-              <w:t>MIG-001</w:t>
-            </w:r>
-          </w:p>
-        </w:tc>
-        <w:tc>
-          <w:tcPr>
-            <w:tcW w:type="dxa" w:w="720"/>
-            <w:vAlign w:val="center"/>
-            <w:tcMar>
-              <w:top w:w="80" w:type="dxa"/>
-              <w:start w:w="120" w:type="dxa"/>
-              <w:bottom w:w="80" w:type="dxa"/>
-              <w:end w:w="120" w:type="dxa"/>
-            </w:tcMar>
-          </w:tcPr>
-          <w:p>
-            <w:pPr>
-              <w:spacing w:after="0" w:line="252" w:lineRule="auto"/>
-              <w:jc w:val="center"/>
-            </w:pPr>
-            <w:r>
-              <w:rPr>
-                <w:rFonts w:ascii="Calibri" w:hAnsi="Calibri" w:eastAsia="Microsoft YaHei"/>
-                <w:color w:val="172B3A"/>
-                <w:sz w:val="15"/>
-              </w:rPr>
-              <w:t>P0</w:t>
-            </w:r>
-          </w:p>
-        </w:tc>
-        <w:tc>
-          <w:tcPr>
-            <w:tcW w:type="dxa" w:w="3600"/>
-            <w:vAlign w:val="center"/>
-            <w:tcMar>
-              <w:top w:w="80" w:type="dxa"/>
-              <w:start w:w="120" w:type="dxa"/>
-              <w:bottom w:w="80" w:type="dxa"/>
-              <w:end w:w="120" w:type="dxa"/>
-            </w:tcMar>
-          </w:tcPr>
-          <w:p>
-            <w:pPr>
-              <w:spacing w:after="0" w:line="252" w:lineRule="auto"/>
-            </w:pPr>
-            <w:r>
-              <w:rPr>
-                <w:rFonts w:ascii="Calibri" w:hAnsi="Calibri" w:eastAsia="Microsoft YaHei"/>
-                <w:color w:val="172B3A"/>
-                <w:sz w:val="15"/>
-              </w:rPr>
-              <w:t>数据迁移前自动备份；迁移失败恢复收藏、提醒、备注和隐藏状态。</w:t>
-            </w:r>
-          </w:p>
-        </w:tc>
-        <w:tc>
-          <w:tcPr>
-            <w:tcW w:type="dxa" w:w="3000"/>
-            <w:vAlign w:val="center"/>
-            <w:tcMar>
-              <w:top w:w="80" w:type="dxa"/>
-              <w:start w:w="120" w:type="dxa"/>
-              <w:bottom w:w="80" w:type="dxa"/>
-              <w:end w:w="120" w:type="dxa"/>
-            </w:tcMar>
-          </w:tcPr>
-          <w:p>
-            <w:pPr>
-              <w:spacing w:after="0" w:line="252" w:lineRule="auto"/>
-            </w:pPr>
-            <w:r>
-              <w:rPr>
-                <w:rFonts w:ascii="Calibri" w:hAnsi="Calibri" w:eastAsia="Microsoft YaHei"/>
-                <w:color w:val="172B3A"/>
-                <w:sz w:val="15"/>
-              </w:rPr>
-              <w:t>注入迁移失败并核对前后数据哈希。</w:t>
-            </w:r>
-          </w:p>
-        </w:tc>
-        <w:tc>
-          <w:tcPr>
-            <w:tcW w:type="dxa" w:w="1800"/>
-            <w:vAlign w:val="center"/>
-            <w:tcMar>
-              <w:top w:w="80" w:type="dxa"/>
-              <w:start w:w="120" w:type="dxa"/>
-              <w:bottom w:w="80" w:type="dxa"/>
-              <w:end w:w="120" w:type="dxa"/>
-            </w:tcMar>
-          </w:tcPr>
-          <w:p>
-            <w:pPr>
-              <w:spacing w:after="0" w:line="252" w:lineRule="auto"/>
-            </w:pPr>
-            <w:r>
-              <w:rPr>
-                <w:rFonts w:ascii="Calibri" w:hAnsi="Calibri" w:eastAsia="Microsoft YaHei"/>
-                <w:color w:val="172B3A"/>
-                <w:sz w:val="15"/>
-              </w:rPr>
-              <w:t>迁移与恢复报告</w:t>
-            </w:r>
-          </w:p>
-        </w:tc>
-        <w:tc>
-          <w:tcPr>
-            <w:tcW w:type="dxa" w:w="1800"/>
-            <w:vAlign w:val="center"/>
-            <w:tcMar>
-              <w:top w:w="80" w:type="dxa"/>
-              <w:start w:w="120" w:type="dxa"/>
-              <w:bottom w:w="80" w:type="dxa"/>
-              <w:end w:w="120" w:type="dxa"/>
-            </w:tcMar>
-          </w:tcPr>
-          <w:p>
-            <w:pPr>
-              <w:spacing w:after="0" w:line="252" w:lineRule="auto"/>
-            </w:pPr>
-            <w:r>
-              <w:rPr>
-                <w:rFonts w:ascii="Calibri" w:hAnsi="Calibri" w:eastAsia="Microsoft YaHei"/>
-                <w:color w:val="172B3A"/>
-                <w:sz w:val="15"/>
-              </w:rPr>
-            </w:r>
-          </w:p>
-        </w:tc>
-        <w:tc>
-          <w:tcPr>
-            <w:tcW w:type="dxa" w:w="1200"/>
-            <w:vAlign w:val="center"/>
-            <w:tcMar>
-              <w:top w:w="80" w:type="dxa"/>
-              <w:start w:w="120" w:type="dxa"/>
-              <w:bottom w:w="80" w:type="dxa"/>
-              <w:end w:w="120" w:type="dxa"/>
-            </w:tcMar>
-          </w:tcPr>
-          <w:p>
-            <w:pPr>
-              <w:spacing w:after="0" w:line="252" w:lineRule="auto"/>
-            </w:pPr>
-            <w:r>
-              <w:rPr>
-                <w:rFonts w:ascii="Calibri" w:hAnsi="Calibri" w:eastAsia="Microsoft YaHei"/>
-                <w:color w:val="172B3A"/>
-                <w:sz w:val="15"/>
-              </w:rPr>
-            </w:r>
-          </w:p>
-        </w:tc>
-        <w:tc>
-          <w:tcPr>
-            <w:tcW w:type="dxa" w:w="1500"/>
-            <w:vAlign w:val="center"/>
-            <w:tcMar>
-              <w:top w:w="80" w:type="dxa"/>
-              <w:start w:w="120" w:type="dxa"/>
-              <w:bottom w:w="80" w:type="dxa"/>
-              <w:end w:w="120" w:type="dxa"/>
-            </w:tcMar>
-          </w:tcPr>
-          <w:p>
-            <w:pPr>
-              <w:spacing w:after="0" w:line="252" w:lineRule="auto"/>
-            </w:pPr>
-            <w:r>
-              <w:rPr>
-                <w:rFonts w:ascii="Calibri" w:hAnsi="Calibri" w:eastAsia="Microsoft YaHei"/>
-                <w:color w:val="172B3A"/>
-                <w:sz w:val="15"/>
-              </w:rPr>
-              <w:t>□通过 □失败</w:t>
-            </w:r>
-          </w:p>
-        </w:tc>
-      </w:tr>
-      <w:tr>
-        <w:tc>
-          <w:tcPr>
-            <w:tcW w:type="dxa" w:w="900"/>
-            <w:vAlign w:val="center"/>
-            <w:tcMar>
-              <w:top w:w="80" w:type="dxa"/>
-              <w:start w:w="120" w:type="dxa"/>
-              <w:bottom w:w="80" w:type="dxa"/>
-              <w:end w:w="120" w:type="dxa"/>
-            </w:tcMar>
-          </w:tcPr>
-          <w:p>
-            <w:pPr>
-              <w:spacing w:after="0" w:line="252" w:lineRule="auto"/>
-              <w:jc w:val="center"/>
-            </w:pPr>
-            <w:r>
-              <w:rPr>
-                <w:rFonts w:ascii="Calibri" w:hAnsi="Calibri" w:eastAsia="Microsoft YaHei"/>
-                <w:color w:val="172B3A"/>
-                <w:sz w:val="15"/>
-              </w:rPr>
-              <w:t>SEC-001</w:t>
-            </w:r>
-          </w:p>
-        </w:tc>
-        <w:tc>
-          <w:tcPr>
-            <w:tcW w:type="dxa" w:w="720"/>
-            <w:vAlign w:val="center"/>
-            <w:tcMar>
-              <w:top w:w="80" w:type="dxa"/>
-              <w:start w:w="120" w:type="dxa"/>
-              <w:bottom w:w="80" w:type="dxa"/>
-              <w:end w:w="120" w:type="dxa"/>
-            </w:tcMar>
-          </w:tcPr>
-          <w:p>
-            <w:pPr>
-              <w:spacing w:after="0" w:line="252" w:lineRule="auto"/>
-              <w:jc w:val="center"/>
-            </w:pPr>
-            <w:r>
-              <w:rPr>
-                <w:rFonts w:ascii="Calibri" w:hAnsi="Calibri" w:eastAsia="Microsoft YaHei"/>
-                <w:color w:val="172B3A"/>
-                <w:sz w:val="15"/>
-              </w:rPr>
-              <w:t>P0</w:t>
-            </w:r>
-          </w:p>
-        </w:tc>
-        <w:tc>
-          <w:tcPr>
-            <w:tcW w:type="dxa" w:w="3600"/>
-            <w:vAlign w:val="center"/>
-            <w:tcMar>
-              <w:top w:w="80" w:type="dxa"/>
-              <w:start w:w="120" w:type="dxa"/>
-              <w:bottom w:w="80" w:type="dxa"/>
-              <w:end w:w="120" w:type="dxa"/>
-            </w:tcMar>
-          </w:tcPr>
-          <w:p>
-            <w:pPr>
-              <w:spacing w:after="0" w:line="252" w:lineRule="auto"/>
-            </w:pPr>
-            <w:r>
-              <w:rPr>
-                <w:rFonts w:ascii="Calibri" w:hAnsi="Calibri" w:eastAsia="Microsoft YaHei"/>
-                <w:color w:val="172B3A"/>
-                <w:sz w:val="15"/>
-              </w:rPr>
-              <w:t>外链仅允许已登记HTTPS官方域名；非法协议和未登记域名被阻止。</w:t>
-            </w:r>
-          </w:p>
-        </w:tc>
-        <w:tc>
-          <w:tcPr>
-            <w:tcW w:type="dxa" w:w="3000"/>
-            <w:vAlign w:val="center"/>
-            <w:tcMar>
-              <w:top w:w="80" w:type="dxa"/>
-              <w:start w:w="120" w:type="dxa"/>
-              <w:bottom w:w="80" w:type="dxa"/>
-              <w:end w:w="120" w:type="dxa"/>
-            </w:tcMar>
-          </w:tcPr>
-          <w:p>
-            <w:pPr>
-              <w:spacing w:after="0" w:line="252" w:lineRule="auto"/>
-            </w:pPr>
-            <w:r>
-              <w:rPr>
-                <w:rFonts w:ascii="Calibri" w:hAnsi="Calibri" w:eastAsia="Microsoft YaHei"/>
-                <w:color w:val="172B3A"/>
-                <w:sz w:val="15"/>
-              </w:rPr>
-              <w:t>测试http、file、javascript及未知域名。</w:t>
-            </w:r>
-          </w:p>
-        </w:tc>
-        <w:tc>
-          <w:tcPr>
-            <w:tcW w:type="dxa" w:w="1800"/>
-            <w:vAlign w:val="center"/>
-            <w:tcMar>
-              <w:top w:w="80" w:type="dxa"/>
-              <w:start w:w="120" w:type="dxa"/>
-              <w:bottom w:w="80" w:type="dxa"/>
-              <w:end w:w="120" w:type="dxa"/>
-            </w:tcMar>
-          </w:tcPr>
-          <w:p>
-            <w:pPr>
-              <w:spacing w:after="0" w:line="252" w:lineRule="auto"/>
-            </w:pPr>
-            <w:r>
-              <w:rPr>
-                <w:rFonts w:ascii="Calibri" w:hAnsi="Calibri" w:eastAsia="Microsoft YaHei"/>
-                <w:color w:val="172B3A"/>
-                <w:sz w:val="15"/>
-              </w:rPr>
-              <w:t>安全测试报告</w:t>
-            </w:r>
-          </w:p>
-        </w:tc>
-        <w:tc>
-          <w:tcPr>
-            <w:tcW w:type="dxa" w:w="1800"/>
-            <w:vAlign w:val="center"/>
-            <w:tcMar>
-              <w:top w:w="80" w:type="dxa"/>
-              <w:start w:w="120" w:type="dxa"/>
-              <w:bottom w:w="80" w:type="dxa"/>
-              <w:end w:w="120" w:type="dxa"/>
-            </w:tcMar>
-          </w:tcPr>
-          <w:p>
-            <w:pPr>
-              <w:spacing w:after="0" w:line="252" w:lineRule="auto"/>
-            </w:pPr>
-            <w:r>
-              <w:rPr>
-                <w:rFonts w:ascii="Calibri" w:hAnsi="Calibri" w:eastAsia="Microsoft YaHei"/>
-                <w:color w:val="172B3A"/>
-                <w:sz w:val="15"/>
-              </w:rPr>
-            </w:r>
-          </w:p>
-        </w:tc>
-        <w:tc>
-          <w:tcPr>
-            <w:tcW w:type="dxa" w:w="1200"/>
-            <w:vAlign w:val="center"/>
-            <w:tcMar>
-              <w:top w:w="80" w:type="dxa"/>
-              <w:start w:w="120" w:type="dxa"/>
-              <w:bottom w:w="80" w:type="dxa"/>
-              <w:end w:w="120" w:type="dxa"/>
-            </w:tcMar>
-          </w:tcPr>
-          <w:p>
-            <w:pPr>
-              <w:spacing w:after="0" w:line="252" w:lineRule="auto"/>
-            </w:pPr>
-            <w:r>
-              <w:rPr>
-                <w:rFonts w:ascii="Calibri" w:hAnsi="Calibri" w:eastAsia="Microsoft YaHei"/>
-                <w:color w:val="172B3A"/>
-                <w:sz w:val="15"/>
-              </w:rPr>
-            </w:r>
-          </w:p>
-        </w:tc>
-        <w:tc>
-          <w:tcPr>
-            <w:tcW w:type="dxa" w:w="1500"/>
-            <w:vAlign w:val="center"/>
-            <w:tcMar>
-              <w:top w:w="80" w:type="dxa"/>
-              <w:start w:w="120" w:type="dxa"/>
-              <w:bottom w:w="80" w:type="dxa"/>
-              <w:end w:w="120" w:type="dxa"/>
-            </w:tcMar>
-          </w:tcPr>
-          <w:p>
-            <w:pPr>
-              <w:spacing w:after="0" w:line="252" w:lineRule="auto"/>
-            </w:pPr>
-            <w:r>
-              <w:rPr>
-                <w:rFonts w:ascii="Calibri" w:hAnsi="Calibri" w:eastAsia="Microsoft YaHei"/>
-                <w:color w:val="172B3A"/>
-                <w:sz w:val="15"/>
-              </w:rPr>
-              <w:t>□通过 □失败</w:t>
-            </w:r>
-          </w:p>
-        </w:tc>
-      </w:tr>
-      <w:tr>
-        <w:tc>
-          <w:tcPr>
-            <w:tcW w:type="dxa" w:w="900"/>
-            <w:vAlign w:val="center"/>
-            <w:tcMar>
-              <w:top w:w="80" w:type="dxa"/>
-              <w:start w:w="120" w:type="dxa"/>
-              <w:bottom w:w="80" w:type="dxa"/>
-              <w:end w:w="120" w:type="dxa"/>
-            </w:tcMar>
-          </w:tcPr>
-          <w:p>
-            <w:pPr>
-              <w:spacing w:after="0" w:line="252" w:lineRule="auto"/>
-              <w:jc w:val="center"/>
-            </w:pPr>
-            <w:r>
-              <w:rPr>
-                <w:rFonts w:ascii="Calibri" w:hAnsi="Calibri" w:eastAsia="Microsoft YaHei"/>
-                <w:color w:val="172B3A"/>
-                <w:sz w:val="15"/>
-              </w:rPr>
-              <w:t>PRI-001</w:t>
-            </w:r>
-          </w:p>
-        </w:tc>
-        <w:tc>
-          <w:tcPr>
-            <w:tcW w:type="dxa" w:w="720"/>
-            <w:vAlign w:val="center"/>
-            <w:tcMar>
-              <w:top w:w="80" w:type="dxa"/>
-              <w:start w:w="120" w:type="dxa"/>
-              <w:bottom w:w="80" w:type="dxa"/>
-              <w:end w:w="120" w:type="dxa"/>
-            </w:tcMar>
-          </w:tcPr>
-          <w:p>
-            <w:pPr>
-              <w:spacing w:after="0" w:line="252" w:lineRule="auto"/>
-              <w:jc w:val="center"/>
-            </w:pPr>
-            <w:r>
-              <w:rPr>
-                <w:rFonts w:ascii="Calibri" w:hAnsi="Calibri" w:eastAsia="Microsoft YaHei"/>
-                <w:color w:val="172B3A"/>
-                <w:sz w:val="15"/>
-              </w:rPr>
-              <w:t>P0</w:t>
-            </w:r>
-          </w:p>
-        </w:tc>
-        <w:tc>
-          <w:tcPr>
-            <w:tcW w:type="dxa" w:w="3600"/>
-            <w:vAlign w:val="center"/>
-            <w:tcMar>
-              <w:top w:w="80" w:type="dxa"/>
-              <w:start w:w="120" w:type="dxa"/>
-              <w:bottom w:w="80" w:type="dxa"/>
-              <w:end w:w="120" w:type="dxa"/>
-            </w:tcMar>
-          </w:tcPr>
-          <w:p>
-            <w:pPr>
-              <w:spacing w:after="0" w:line="252" w:lineRule="auto"/>
-            </w:pPr>
-            <w:r>
-              <w:rPr>
-                <w:rFonts w:ascii="Calibri" w:hAnsi="Calibri" w:eastAsia="Microsoft YaHei"/>
-                <w:color w:val="172B3A"/>
-                <w:sz w:val="15"/>
-              </w:rPr>
-              <w:t>收藏、备注、计划、提醒和隐藏状态不上传。</w:t>
-            </w:r>
-          </w:p>
-        </w:tc>
-        <w:tc>
-          <w:tcPr>
-            <w:tcW w:type="dxa" w:w="3000"/>
-            <w:vAlign w:val="center"/>
-            <w:tcMar>
-              <w:top w:w="80" w:type="dxa"/>
-              <w:start w:w="120" w:type="dxa"/>
-              <w:bottom w:w="80" w:type="dxa"/>
-              <w:end w:w="120" w:type="dxa"/>
-            </w:tcMar>
-          </w:tcPr>
-          <w:p>
-            <w:pPr>
-              <w:spacing w:after="0" w:line="252" w:lineRule="auto"/>
-            </w:pPr>
-            <w:r>
-              <w:rPr>
-                <w:rFonts w:ascii="Calibri" w:hAnsi="Calibri" w:eastAsia="Microsoft YaHei"/>
-                <w:color w:val="172B3A"/>
-                <w:sz w:val="15"/>
-              </w:rPr>
-              <w:t>抓包并检查应用数据流。</w:t>
-            </w:r>
-          </w:p>
-        </w:tc>
-        <w:tc>
-          <w:tcPr>
-            <w:tcW w:type="dxa" w:w="1800"/>
-            <w:vAlign w:val="center"/>
-            <w:tcMar>
-              <w:top w:w="80" w:type="dxa"/>
-              <w:start w:w="120" w:type="dxa"/>
-              <w:bottom w:w="80" w:type="dxa"/>
-              <w:end w:w="120" w:type="dxa"/>
-            </w:tcMar>
-          </w:tcPr>
-          <w:p>
-            <w:pPr>
-              <w:spacing w:after="0" w:line="252" w:lineRule="auto"/>
-            </w:pPr>
-            <w:r>
-              <w:rPr>
-                <w:rFonts w:ascii="Calibri" w:hAnsi="Calibri" w:eastAsia="Microsoft YaHei"/>
-                <w:color w:val="172B3A"/>
-                <w:sz w:val="15"/>
-              </w:rPr>
               <w:t>网络抓包报告</w:t>
-            </w:r>
-          </w:p>
-        </w:tc>
-        <w:tc>
-          <w:tcPr>
-            <w:tcW w:type="dxa" w:w="1800"/>
-            <w:vAlign w:val="center"/>
-            <w:tcMar>
-              <w:top w:w="80" w:type="dxa"/>
-              <w:start w:w="120" w:type="dxa"/>
-              <w:bottom w:w="80" w:type="dxa"/>
-              <w:end w:w="120" w:type="dxa"/>
-            </w:tcMar>
-          </w:tcPr>
-          <w:p>
-            <w:pPr>
-              <w:spacing w:after="0" w:line="252" w:lineRule="auto"/>
-            </w:pPr>
-            <w:r>
-              <w:rPr>
-                <w:rFonts w:ascii="Calibri" w:hAnsi="Calibri" w:eastAsia="Microsoft YaHei"/>
-                <w:color w:val="172B3A"/>
-                <w:sz w:val="15"/>
-              </w:rPr>
-            </w:r>
-          </w:p>
-        </w:tc>
-        <w:tc>
-          <w:tcPr>
-            <w:tcW w:type="dxa" w:w="1200"/>
-            <w:vAlign w:val="center"/>
-            <w:tcMar>
-              <w:top w:w="80" w:type="dxa"/>
-              <w:start w:w="120" w:type="dxa"/>
-              <w:bottom w:w="80" w:type="dxa"/>
-              <w:end w:w="120" w:type="dxa"/>
-            </w:tcMar>
-          </w:tcPr>
-          <w:p>
-            <w:pPr>
-              <w:spacing w:after="0" w:line="252" w:lineRule="auto"/>
-            </w:pPr>
-            <w:r>
-              <w:rPr>
-                <w:rFonts w:ascii="Calibri" w:hAnsi="Calibri" w:eastAsia="Microsoft YaHei"/>
-                <w:color w:val="172B3A"/>
-                <w:sz w:val="15"/>
-              </w:rPr>
-            </w:r>
-          </w:p>
-        </w:tc>
-        <w:tc>
-          <w:tcPr>
-            <w:tcW w:type="dxa" w:w="1500"/>
-            <w:vAlign w:val="center"/>
-            <w:tcMar>
-              <w:top w:w="80" w:type="dxa"/>
-              <w:start w:w="120" w:type="dxa"/>
-              <w:bottom w:w="80" w:type="dxa"/>
-              <w:end w:w="120" w:type="dxa"/>
-            </w:tcMar>
-          </w:tcPr>
-          <w:p>
-            <w:pPr>
-              <w:spacing w:after="0" w:line="252" w:lineRule="auto"/>
-            </w:pPr>
-            <w:r>
-              <w:rPr>
-                <w:rFonts w:ascii="Calibri" w:hAnsi="Calibri" w:eastAsia="Microsoft YaHei"/>
-                <w:color w:val="172B3A"/>
-                <w:sz w:val="15"/>
-              </w:rPr>
-              <w:t>□通过 □失败</w:t>
-            </w:r>
-          </w:p>
-        </w:tc>
-      </w:tr>
-      <w:tr>
-        <w:tc>
-          <w:tcPr>
-            <w:tcW w:type="dxa" w:w="900"/>
-            <w:vAlign w:val="center"/>
-            <w:tcMar>
-              <w:top w:w="80" w:type="dxa"/>
-              <w:start w:w="120" w:type="dxa"/>
-              <w:bottom w:w="80" w:type="dxa"/>
-              <w:end w:w="120" w:type="dxa"/>
-            </w:tcMar>
-          </w:tcPr>
-          <w:p>
-            <w:pPr>
-              <w:spacing w:after="0" w:line="252" w:lineRule="auto"/>
-              <w:jc w:val="center"/>
-            </w:pPr>
-            <w:r>
-              <w:rPr>
-                <w:rFonts w:ascii="Calibri" w:hAnsi="Calibri" w:eastAsia="Microsoft YaHei"/>
-                <w:color w:val="172B3A"/>
-                <w:sz w:val="15"/>
-              </w:rPr>
-              <w:t>SEC-002</w:t>
-            </w:r>
-          </w:p>
-        </w:tc>
-        <w:tc>
-          <w:tcPr>
-            <w:tcW w:type="dxa" w:w="720"/>
-            <w:vAlign w:val="center"/>
-            <w:tcMar>
-              <w:top w:w="80" w:type="dxa"/>
-              <w:start w:w="120" w:type="dxa"/>
-              <w:bottom w:w="80" w:type="dxa"/>
-              <w:end w:w="120" w:type="dxa"/>
-            </w:tcMar>
-          </w:tcPr>
-          <w:p>
-            <w:pPr>
-              <w:spacing w:after="0" w:line="252" w:lineRule="auto"/>
-              <w:jc w:val="center"/>
-            </w:pPr>
-            <w:r>
-              <w:rPr>
-                <w:rFonts w:ascii="Calibri" w:hAnsi="Calibri" w:eastAsia="Microsoft YaHei"/>
-                <w:color w:val="172B3A"/>
-                <w:sz w:val="15"/>
-              </w:rPr>
-              <w:t>P0</w:t>
-            </w:r>
-          </w:p>
-        </w:tc>
-        <w:tc>
-          <w:tcPr>
-            <w:tcW w:type="dxa" w:w="3600"/>
-            <w:vAlign w:val="center"/>
-            <w:tcMar>
-              <w:top w:w="80" w:type="dxa"/>
-              <w:start w:w="120" w:type="dxa"/>
-              <w:bottom w:w="80" w:type="dxa"/>
-              <w:end w:w="120" w:type="dxa"/>
-            </w:tcMar>
-          </w:tcPr>
-          <w:p>
-            <w:pPr>
-              <w:spacing w:after="0" w:line="252" w:lineRule="auto"/>
-            </w:pPr>
-            <w:r>
-              <w:rPr>
-                <w:rFonts w:ascii="Calibri" w:hAnsi="Calibri" w:eastAsia="Microsoft YaHei"/>
-                <w:color w:val="172B3A"/>
-                <w:sz w:val="15"/>
-              </w:rPr>
-              <w:t>审核后台具备最小权限、限速、CSRF防护、输入校验、MFA和审计日志。</w:t>
-            </w:r>
-          </w:p>
-        </w:tc>
-        <w:tc>
-          <w:tcPr>
-            <w:tcW w:type="dxa" w:w="3000"/>
-            <w:vAlign w:val="center"/>
-            <w:tcMar>
-              <w:top w:w="80" w:type="dxa"/>
-              <w:start w:w="120" w:type="dxa"/>
-              <w:bottom w:w="80" w:type="dxa"/>
-              <w:end w:w="120" w:type="dxa"/>
-            </w:tcMar>
-          </w:tcPr>
-          <w:p>
-            <w:pPr>
-              <w:spacing w:after="0" w:line="252" w:lineRule="auto"/>
-            </w:pPr>
-            <w:r>
-              <w:rPr>
-                <w:rFonts w:ascii="Calibri" w:hAnsi="Calibri" w:eastAsia="Microsoft YaHei"/>
-                <w:color w:val="172B3A"/>
-                <w:sz w:val="15"/>
-              </w:rPr>
-              <w:t>执行OWASP基线和越权测试。</w:t>
-            </w:r>
-          </w:p>
-        </w:tc>
-        <w:tc>
-          <w:tcPr>
-            <w:tcW w:type="dxa" w:w="1800"/>
-            <w:vAlign w:val="center"/>
-            <w:tcMar>
-              <w:top w:w="80" w:type="dxa"/>
-              <w:start w:w="120" w:type="dxa"/>
-              <w:bottom w:w="80" w:type="dxa"/>
-              <w:end w:w="120" w:type="dxa"/>
-            </w:tcMar>
-          </w:tcPr>
-          <w:p>
-            <w:pPr>
-              <w:spacing w:after="0" w:line="252" w:lineRule="auto"/>
-            </w:pPr>
-            <w:r>
-              <w:rPr>
-                <w:rFonts w:ascii="Calibri" w:hAnsi="Calibri" w:eastAsia="Microsoft YaHei"/>
-                <w:color w:val="172B3A"/>
-                <w:sz w:val="15"/>
-              </w:rPr>
-              <w:t>渗透测试报告</w:t>
             </w:r>
           </w:p>
         </w:tc>
@@ -15125,7 +13660,7 @@
                 <w:color w:val="172B3A"/>
                 <w:sz w:val="18"/>
               </w:rPr>
-              <w:t>56</w:t>
+              <w:t>49</w:t>
             </w:r>
           </w:p>
         </w:tc>
@@ -22838,7 +21373,7 @@
                 <w:color w:val="172B3A"/>
                 <w:sz w:val="18"/>
               </w:rPr>
-              <w:t>完整持久化；不以提醒列表替代。</w:t>
+              <w:t>完整持久化。</w:t>
             </w:r>
           </w:p>
         </w:tc>
@@ -22866,7 +21401,7 @@
                 <w:color w:val="172B3A"/>
                 <w:sz w:val="18"/>
               </w:rPr>
-              <w:t>FUN-06</w:t>
+              <w:t>FUN-07</w:t>
             </w:r>
           </w:p>
         </w:tc>
@@ -22892,7 +21427,7 @@
                 <w:color w:val="172B3A"/>
                 <w:sz w:val="18"/>
               </w:rPr>
-              <w:t>提醒状态机</w:t>
+              <w:t>日历</w:t>
             </w:r>
           </w:p>
         </w:tc>
@@ -22917,7 +21452,7 @@
                 <w:color w:val="172B3A"/>
                 <w:sz w:val="18"/>
               </w:rPr>
-              <w:t>添加、修改、暂停、恢复、触发和取消提醒。</w:t>
+              <w:t>跨月查看报名、初赛、复赛、决赛和结果节点。</w:t>
             </w:r>
           </w:p>
         </w:tc>
@@ -22942,7 +21477,7 @@
                 <w:color w:val="172B3A"/>
                 <w:sz w:val="18"/>
               </w:rPr>
-              <w:t>状态和触发时间准确；不重复弹出。</w:t>
+              <w:t>节点、筛选、今天与反向跳转全部可用。</w:t>
             </w:r>
           </w:p>
         </w:tc>
@@ -22970,7 +21505,7 @@
                 <w:color w:val="172B3A"/>
                 <w:sz w:val="18"/>
               </w:rPr>
-              <w:t>FUN-07</w:t>
+              <w:t>FUN-08</w:t>
             </w:r>
           </w:p>
         </w:tc>
@@ -22996,7 +21531,7 @@
                 <w:color w:val="172B3A"/>
                 <w:sz w:val="18"/>
               </w:rPr>
-              <w:t>日历</w:t>
+              <w:t>数据更新</w:t>
             </w:r>
           </w:p>
         </w:tc>
@@ -23021,7 +21556,7 @@
                 <w:color w:val="172B3A"/>
                 <w:sz w:val="18"/>
               </w:rPr>
-              <w:t>跨月查看报名、初赛、复赛、决赛和结果节点。</w:t>
+              <w:t>发布新数据包并修改一条已核验竞赛日期。</w:t>
             </w:r>
           </w:p>
         </w:tc>
@@ -23046,7 +21581,7 @@
                 <w:color w:val="172B3A"/>
                 <w:sz w:val="18"/>
               </w:rPr>
-              <w:t>节点、筛选、今天与反向跳转全部可用。</w:t>
+              <w:t>签名验证通过；显示变更；旧日期可查。</w:t>
             </w:r>
           </w:p>
         </w:tc>
@@ -23074,7 +21609,7 @@
                 <w:color w:val="172B3A"/>
                 <w:sz w:val="18"/>
               </w:rPr>
-              <w:t>FUN-08</w:t>
+              <w:t>FUN-09</w:t>
             </w:r>
           </w:p>
         </w:tc>
@@ -23100,7 +21635,7 @@
                 <w:color w:val="172B3A"/>
                 <w:sz w:val="18"/>
               </w:rPr>
-              <w:t>数据更新</w:t>
+              <w:t>失败恢复</w:t>
             </w:r>
           </w:p>
         </w:tc>
@@ -23125,7 +21660,7 @@
                 <w:color w:val="172B3A"/>
                 <w:sz w:val="18"/>
               </w:rPr>
-              <w:t>发布新数据包并修改一条已提醒竞赛日期。</w:t>
+              <w:t>同步中断、数据包损坏、磁盘不足后重试。</w:t>
             </w:r>
           </w:p>
         </w:tc>
@@ -23150,215 +21685,7 @@
                 <w:color w:val="172B3A"/>
                 <w:sz w:val="18"/>
               </w:rPr>
-              <w:t>签名验证通过；显示变更；提醒重算；旧日期可查。</w:t>
-            </w:r>
-          </w:p>
-        </w:tc>
-      </w:tr>
-      <w:tr>
-        <w:tc>
-          <w:tcPr>
-            <w:tcW w:type="dxa" w:w="1200"/>
-            <w:vAlign w:val="center"/>
-            <w:tcMar>
-              <w:top w:w="80" w:type="dxa"/>
-              <w:start w:w="120" w:type="dxa"/>
-              <w:bottom w:w="80" w:type="dxa"/>
-              <w:end w:w="120" w:type="dxa"/>
-            </w:tcMar>
-          </w:tcPr>
-          <w:p>
-            <w:pPr>
-              <w:spacing w:after="0" w:line="252" w:lineRule="auto"/>
-              <w:jc w:val="center"/>
-            </w:pPr>
-            <w:r>
-              <w:rPr>
-                <w:rFonts w:ascii="Calibri" w:hAnsi="Calibri" w:eastAsia="Microsoft YaHei"/>
-                <w:color w:val="172B3A"/>
-                <w:sz w:val="18"/>
-              </w:rPr>
-              <w:t>FUN-09</w:t>
-            </w:r>
-          </w:p>
-        </w:tc>
-        <w:tc>
-          <w:tcPr>
-            <w:tcW w:type="dxa" w:w="1500"/>
-            <w:vAlign w:val="center"/>
-            <w:tcMar>
-              <w:top w:w="80" w:type="dxa"/>
-              <w:start w:w="120" w:type="dxa"/>
-              <w:bottom w:w="80" w:type="dxa"/>
-              <w:end w:w="120" w:type="dxa"/>
-            </w:tcMar>
-          </w:tcPr>
-          <w:p>
-            <w:pPr>
-              <w:spacing w:after="0" w:line="252" w:lineRule="auto"/>
-              <w:jc w:val="center"/>
-            </w:pPr>
-            <w:r>
-              <w:rPr>
-                <w:rFonts w:ascii="Calibri" w:hAnsi="Calibri" w:eastAsia="Microsoft YaHei"/>
-                <w:color w:val="172B3A"/>
-                <w:sz w:val="18"/>
-              </w:rPr>
-              <w:t>失败恢复</w:t>
-            </w:r>
-          </w:p>
-        </w:tc>
-        <w:tc>
-          <w:tcPr>
-            <w:tcW w:type="dxa" w:w="3500"/>
-            <w:vAlign w:val="center"/>
-            <w:tcMar>
-              <w:top w:w="80" w:type="dxa"/>
-              <w:start w:w="120" w:type="dxa"/>
-              <w:bottom w:w="80" w:type="dxa"/>
-              <w:end w:w="120" w:type="dxa"/>
-            </w:tcMar>
-          </w:tcPr>
-          <w:p>
-            <w:pPr>
-              <w:spacing w:after="0" w:line="252" w:lineRule="auto"/>
-            </w:pPr>
-            <w:r>
-              <w:rPr>
-                <w:rFonts w:ascii="Calibri" w:hAnsi="Calibri" w:eastAsia="Microsoft YaHei"/>
-                <w:color w:val="172B3A"/>
-                <w:sz w:val="18"/>
-              </w:rPr>
-              <w:t>同步中断、数据包损坏、磁盘不足后重试。</w:t>
-            </w:r>
-          </w:p>
-        </w:tc>
-        <w:tc>
-          <w:tcPr>
-            <w:tcW w:type="dxa" w:w="3160"/>
-            <w:vAlign w:val="center"/>
-            <w:tcMar>
-              <w:top w:w="80" w:type="dxa"/>
-              <w:start w:w="120" w:type="dxa"/>
-              <w:bottom w:w="80" w:type="dxa"/>
-              <w:end w:w="120" w:type="dxa"/>
-            </w:tcMar>
-          </w:tcPr>
-          <w:p>
-            <w:pPr>
-              <w:spacing w:after="0" w:line="252" w:lineRule="auto"/>
-            </w:pPr>
-            <w:r>
-              <w:rPr>
-                <w:rFonts w:ascii="Calibri" w:hAnsi="Calibri" w:eastAsia="Microsoft YaHei"/>
-                <w:color w:val="172B3A"/>
-                <w:sz w:val="18"/>
-              </w:rPr>
               <w:t>旧数据可用；错误明确；修复后可恢复。</w:t>
-            </w:r>
-          </w:p>
-        </w:tc>
-      </w:tr>
-      <w:tr>
-        <w:tc>
-          <w:tcPr>
-            <w:tcW w:type="dxa" w:w="1200"/>
-            <w:vAlign w:val="center"/>
-            <w:tcMar>
-              <w:top w:w="80" w:type="dxa"/>
-              <w:start w:w="120" w:type="dxa"/>
-              <w:bottom w:w="80" w:type="dxa"/>
-              <w:end w:w="120" w:type="dxa"/>
-            </w:tcMar>
-          </w:tcPr>
-          <w:p>
-            <w:pPr>
-              <w:spacing w:after="0" w:line="252" w:lineRule="auto"/>
-              <w:jc w:val="center"/>
-            </w:pPr>
-            <w:r>
-              <w:rPr>
-                <w:rFonts w:ascii="Calibri" w:hAnsi="Calibri" w:eastAsia="Microsoft YaHei"/>
-                <w:color w:val="172B3A"/>
-                <w:sz w:val="18"/>
-              </w:rPr>
-              <w:t>FUN-10</w:t>
-            </w:r>
-          </w:p>
-        </w:tc>
-        <w:tc>
-          <w:tcPr>
-            <w:tcW w:type="dxa" w:w="1500"/>
-            <w:vAlign w:val="center"/>
-            <w:tcMar>
-              <w:top w:w="80" w:type="dxa"/>
-              <w:start w:w="120" w:type="dxa"/>
-              <w:bottom w:w="80" w:type="dxa"/>
-              <w:end w:w="120" w:type="dxa"/>
-            </w:tcMar>
-          </w:tcPr>
-          <w:p>
-            <w:pPr>
-              <w:spacing w:after="0" w:line="252" w:lineRule="auto"/>
-              <w:jc w:val="center"/>
-            </w:pPr>
-            <w:r>
-              <w:rPr>
-                <w:rFonts w:ascii="Calibri" w:hAnsi="Calibri" w:eastAsia="Microsoft YaHei"/>
-                <w:color w:val="172B3A"/>
-                <w:sz w:val="18"/>
-              </w:rPr>
-              <w:t>社区提交</w:t>
-            </w:r>
-          </w:p>
-        </w:tc>
-        <w:tc>
-          <w:tcPr>
-            <w:tcW w:type="dxa" w:w="3500"/>
-            <w:vAlign w:val="center"/>
-            <w:tcMar>
-              <w:top w:w="80" w:type="dxa"/>
-              <w:start w:w="120" w:type="dxa"/>
-              <w:bottom w:w="80" w:type="dxa"/>
-              <w:end w:w="120" w:type="dxa"/>
-            </w:tcMar>
-          </w:tcPr>
-          <w:p>
-            <w:pPr>
-              <w:spacing w:after="0" w:line="252" w:lineRule="auto"/>
-            </w:pPr>
-            <w:r>
-              <w:rPr>
-                <w:rFonts w:ascii="Calibri" w:hAnsi="Calibri" w:eastAsia="Microsoft YaHei"/>
-                <w:color w:val="172B3A"/>
-                <w:sz w:val="18"/>
-              </w:rPr>
-              <w:t>免登录提交来源并在后台审核、退回、批准和发布。</w:t>
-            </w:r>
-          </w:p>
-        </w:tc>
-        <w:tc>
-          <w:tcPr>
-            <w:tcW w:type="dxa" w:w="3160"/>
-            <w:vAlign w:val="center"/>
-            <w:tcMar>
-              <w:top w:w="80" w:type="dxa"/>
-              <w:start w:w="120" w:type="dxa"/>
-              <w:bottom w:w="80" w:type="dxa"/>
-              <w:end w:w="120" w:type="dxa"/>
-            </w:tcMar>
-          </w:tcPr>
-          <w:p>
-            <w:pPr>
-              <w:spacing w:after="0" w:line="252" w:lineRule="auto"/>
-            </w:pPr>
-            <w:r>
-              <w:rPr>
-                <w:rFonts w:ascii="Calibri" w:hAnsi="Calibri" w:eastAsia="Microsoft YaHei"/>
-                <w:color w:val="172B3A"/>
-                <w:sz w:val="18"/>
-              </w:rPr>
-              <w:t>未批准数据不进入生产；全链路可审计。</w:t>
             </w:r>
           </w:p>
         </w:tc>
@@ -24296,84 +22623,7 @@
                 <w:color w:val="172B3A"/>
                 <w:sz w:val="18"/>
               </w:rPr>
-              <w:t>无重复收藏、提醒、提交或更新任务。</w:t>
-            </w:r>
-          </w:p>
-        </w:tc>
-      </w:tr>
-      <w:tr>
-        <w:tc>
-          <w:tcPr>
-            <w:tcW w:type="dxa" w:w="2000"/>
-            <w:vAlign w:val="center"/>
-            <w:tcMar>
-              <w:top w:w="80" w:type="dxa"/>
-              <w:start w:w="120" w:type="dxa"/>
-              <w:bottom w:w="80" w:type="dxa"/>
-              <w:end w:w="120" w:type="dxa"/>
-            </w:tcMar>
-          </w:tcPr>
-          <w:p>
-            <w:pPr>
-              <w:spacing w:after="0" w:line="252" w:lineRule="auto"/>
-            </w:pPr>
-            <w:r>
-              <w:rPr>
-                <w:rFonts w:ascii="Calibri" w:hAnsi="Calibri" w:eastAsia="Microsoft YaHei"/>
-                <w:color w:val="172B3A"/>
-                <w:sz w:val="18"/>
-              </w:rPr>
-              <w:t>后台越权</w:t>
-            </w:r>
-          </w:p>
-        </w:tc>
-        <w:tc>
-          <w:tcPr>
-            <w:tcW w:type="dxa" w:w="3000"/>
-            <w:vAlign w:val="center"/>
-            <w:tcMar>
-              <w:top w:w="80" w:type="dxa"/>
-              <w:start w:w="120" w:type="dxa"/>
-              <w:bottom w:w="80" w:type="dxa"/>
-              <w:end w:w="120" w:type="dxa"/>
-            </w:tcMar>
-          </w:tcPr>
-          <w:p>
-            <w:pPr>
-              <w:spacing w:after="0" w:line="252" w:lineRule="auto"/>
-            </w:pPr>
-            <w:r>
-              <w:rPr>
-                <w:rFonts w:ascii="Calibri" w:hAnsi="Calibri" w:eastAsia="Microsoft YaHei"/>
-                <w:color w:val="172B3A"/>
-                <w:sz w:val="18"/>
-              </w:rPr>
-              <w:t>普通审核员尝试发布</w:t>
-            </w:r>
-          </w:p>
-        </w:tc>
-        <w:tc>
-          <w:tcPr>
-            <w:tcW w:type="dxa" w:w="4360"/>
-            <w:vAlign w:val="center"/>
-            <w:tcMar>
-              <w:top w:w="80" w:type="dxa"/>
-              <w:start w:w="120" w:type="dxa"/>
-              <w:bottom w:w="80" w:type="dxa"/>
-              <w:end w:w="120" w:type="dxa"/>
-            </w:tcMar>
-          </w:tcPr>
-          <w:p>
-            <w:pPr>
-              <w:spacing w:after="0" w:line="252" w:lineRule="auto"/>
-            </w:pPr>
-            <w:r>
-              <w:rPr>
-                <w:rFonts w:ascii="Calibri" w:hAnsi="Calibri" w:eastAsia="Microsoft YaHei"/>
-                <w:color w:val="172B3A"/>
-                <w:sz w:val="18"/>
-              </w:rPr>
-              <w:t>拒绝操作并写入审计日志。</w:t>
+              <w:t>无重复收藏、计划或更新任务。</w:t>
             </w:r>
           </w:p>
         </w:tc>
@@ -25186,7 +23436,7 @@
                 <w:color w:val="172B3A"/>
                 <w:sz w:val="18"/>
               </w:rPr>
-              <w:t>持续运行、更新、检索和提醒</w:t>
+              <w:t>持续运行、更新与检索</w:t>
             </w:r>
           </w:p>
         </w:tc>

</xml_diff>